<commit_message>
Rapport final : 5 screenshots distincts (home, SYN, UDP, DNS, HTTP)
</commit_message>
<xml_diff>
--- a/Rapport_DDoS_NetSim.docx
+++ b/Rapport_DDoS_NetSim.docx
@@ -3295,212 +3295,6 @@
     </w:p>
     <w:p>
       <w:pPr>
-        <w:pStyle w:val="Heading3"/>
-        <w:spacing w:after="80" w:before="200"/>
-      </w:pPr>
-      <w:r>
-        <w:rPr>
-          <w:rFonts w:ascii="Times New Roman" w:cs="Times New Roman" w:eastAsia="Times New Roman" w:hAnsi="Times New Roman"/>
-          <w:b/>
-          <w:bCs/>
-          <w:color w:val="1A1A1A"/>
-          <w:sz w:val="22"/>
-          <w:szCs w:val="22"/>
-        </w:rPr>
-        <w:t xml:space="preserve">Détection et prévention</w:t>
-      </w:r>
-    </w:p>
-    <w:p>
-      <w:pPr>
-        <w:pStyle w:val="ListParagraph"/>
-        <w:numPr>
-          <w:ilvl w:val="0"/>
-          <w:numId w:val="2"/>
-        </w:numPr>
-        <w:spacing w:after="30" w:before="30" w:line="300"/>
-      </w:pPr>
-      <w:r>
-        <w:rPr>
-          <w:rFonts w:ascii="Times New Roman" w:cs="Times New Roman" w:eastAsia="Times New Roman" w:hAnsi="Times New Roman"/>
-          <w:color w:val="1A1A1A"/>
-          <w:sz w:val="22"/>
-          <w:szCs w:val="22"/>
-        </w:rPr>
-        <w:t xml:space="preserve">Augmentation massive du trafic DNS en direction de la cible.</w:t>
-      </w:r>
-    </w:p>
-    <w:p>
-      <w:pPr>
-        <w:pStyle w:val="ListParagraph"/>
-        <w:numPr>
-          <w:ilvl w:val="0"/>
-          <w:numId w:val="2"/>
-        </w:numPr>
-        <w:spacing w:after="30" w:before="30" w:line="300"/>
-      </w:pPr>
-      <w:r>
-        <w:rPr>
-          <w:rFonts w:ascii="Times New Roman" w:cs="Times New Roman" w:eastAsia="Times New Roman" w:hAnsi="Times New Roman"/>
-          <w:color w:val="1A1A1A"/>
-          <w:sz w:val="22"/>
-          <w:szCs w:val="22"/>
-        </w:rPr>
-        <w:t xml:space="preserve">Réponses DNS sans requêtes correspondantes.</w:t>
-      </w:r>
-    </w:p>
-    <w:p>
-      <w:pPr>
-        <w:pStyle w:val="ListParagraph"/>
-        <w:numPr>
-          <w:ilvl w:val="0"/>
-          <w:numId w:val="2"/>
-        </w:numPr>
-        <w:spacing w:after="30" w:before="30" w:line="300"/>
-      </w:pPr>
-      <w:r>
-        <w:rPr>
-          <w:rFonts w:ascii="Times New Roman" w:cs="Times New Roman" w:eastAsia="Times New Roman" w:hAnsi="Times New Roman"/>
-          <w:color w:val="1A1A1A"/>
-          <w:sz w:val="22"/>
-          <w:szCs w:val="22"/>
-        </w:rPr>
-        <w:t xml:space="preserve">Paquets DNS de grande taille (requêtes ANY avec EDNS0).</w:t>
-      </w:r>
-    </w:p>
-    <w:p>
-      <w:pPr>
-        <w:pStyle w:val="ListParagraph"/>
-        <w:numPr>
-          <w:ilvl w:val="0"/>
-          <w:numId w:val="2"/>
-        </w:numPr>
-        <w:spacing w:after="30" w:before="30" w:line="300"/>
-      </w:pPr>
-      <w:r>
-        <w:rPr>
-          <w:rFonts w:ascii="Times New Roman" w:cs="Times New Roman" w:eastAsia="Times New Roman" w:hAnsi="Times New Roman"/>
-          <w:color w:val="1A1A1A"/>
-          <w:sz w:val="22"/>
-          <w:szCs w:val="22"/>
-        </w:rPr>
-        <w:t xml:space="preserve">Prévention : fermeture des résolveurs ouverts, filtrage BCP38, Response Rate Limiting, Anycast DNS.</w:t>
-      </w:r>
-    </w:p>
-    <w:p>
-      <w:pPr>
-        <w:pStyle w:val="Heading2"/>
-        <w:spacing w:after="120" w:before="280"/>
-      </w:pPr>
-      <w:r>
-        <w:rPr>
-          <w:rFonts w:ascii="Times New Roman" w:cs="Times New Roman" w:eastAsia="Times New Roman" w:hAnsi="Times New Roman"/>
-          <w:b/>
-          <w:bCs/>
-          <w:color w:val="415A77"/>
-          <w:sz w:val="26"/>
-          <w:szCs w:val="26"/>
-        </w:rPr>
-        <w:t xml:space="preserve">3.5 Attaque par fragmentation (Teardrop)</w:t>
-      </w:r>
-    </w:p>
-    <w:p>
-      <w:pPr>
-        <w:pStyle w:val="Heading3"/>
-        <w:spacing w:after="80" w:before="200"/>
-      </w:pPr>
-      <w:r>
-        <w:rPr>
-          <w:rFonts w:ascii="Times New Roman" w:cs="Times New Roman" w:eastAsia="Times New Roman" w:hAnsi="Times New Roman"/>
-          <w:b/>
-          <w:bCs/>
-          <w:color w:val="1A1A1A"/>
-          <w:sz w:val="22"/>
-          <w:szCs w:val="22"/>
-        </w:rPr>
-        <w:t xml:space="preserve">Principe technique</w:t>
-      </w:r>
-    </w:p>
-    <w:p>
-      <w:pPr>
-        <w:spacing w:after="100" w:before="40" w:line="320"/>
-        <w:jc w:val="both"/>
-      </w:pPr>
-      <w:r>
-        <w:rPr>
-          <w:rFonts w:ascii="Times New Roman" w:cs="Times New Roman" w:eastAsia="Times New Roman" w:hAnsi="Times New Roman"/>
-          <w:color w:val="1A1A1A"/>
-          <w:sz w:val="22"/>
-          <w:szCs w:val="22"/>
-        </w:rPr>
-        <w:t xml:space="preserve">L’attaque Teardrop exploite des vulnérabilités dans le réassemblage des fragments IP. L’attaquant envoie des fragments volontairement chevauchés (overlapping) ou mal ordonnancés. Certains systèmes d’exploitation anciens (noyaux Linux antérieurs à 2.0.33, Windows 95/NT) ne géraient pas correctement ces chevauchements et pouvaient planter (kernel panic) ou corrompre la mémoire.</w:t>
-      </w:r>
-    </w:p>
-    <w:p>
-      <w:pPr>
-        <w:spacing w:after="100" w:before="40" w:line="320"/>
-        <w:jc w:val="both"/>
-      </w:pPr>
-      <w:r>
-        <w:rPr>
-          <w:rFonts w:ascii="Times New Roman" w:cs="Times New Roman" w:eastAsia="Times New Roman" w:hAnsi="Times New Roman"/>
-          <w:color w:val="1A1A1A"/>
-          <w:sz w:val="22"/>
-          <w:szCs w:val="22"/>
-        </w:rPr>
-        <w:t xml:space="preserve">Les systèmes modernes ne sont plus vulnérables à cette attaque, qui conserve un intérêt principalement pédagogique. Les mesures de prévention incluent la mise à jour des systèmes et le filtrage des fragments anormaux au niveau du pare-feu.</w:t>
-      </w:r>
-    </w:p>
-    <w:p>
-      <w:pPr>
-        <w:pStyle w:val="Heading2"/>
-        <w:spacing w:after="120" w:before="280"/>
-      </w:pPr>
-      <w:r>
-        <w:rPr>
-          <w:rFonts w:ascii="Times New Roman" w:cs="Times New Roman" w:eastAsia="Times New Roman" w:hAnsi="Times New Roman"/>
-          <w:b/>
-          <w:bCs/>
-          <w:color w:val="415A77"/>
-          <w:sz w:val="26"/>
-          <w:szCs w:val="26"/>
-        </w:rPr>
-        <w:t xml:space="preserve">3.6 HTTP Flood</w:t>
-      </w:r>
-    </w:p>
-    <w:p>
-      <w:pPr>
-        <w:pStyle w:val="Heading3"/>
-        <w:spacing w:after="80" w:before="200"/>
-      </w:pPr>
-      <w:r>
-        <w:rPr>
-          <w:rFonts w:ascii="Times New Roman" w:cs="Times New Roman" w:eastAsia="Times New Roman" w:hAnsi="Times New Roman"/>
-          <w:b/>
-          <w:bCs/>
-          <w:color w:val="1A1A1A"/>
-          <w:sz w:val="22"/>
-          <w:szCs w:val="22"/>
-        </w:rPr>
-        <w:t xml:space="preserve">Principe technique</w:t>
-      </w:r>
-    </w:p>
-    <w:p>
-      <w:pPr>
-        <w:spacing w:after="100" w:before="40" w:line="320"/>
-        <w:jc w:val="both"/>
-      </w:pPr>
-      <w:r>
-        <w:rPr>
-          <w:rFonts w:ascii="Times New Roman" w:cs="Times New Roman" w:eastAsia="Times New Roman" w:hAnsi="Times New Roman"/>
-          <w:color w:val="1A1A1A"/>
-          <w:sz w:val="22"/>
-          <w:szCs w:val="22"/>
-        </w:rPr>
-        <w:t xml:space="preserve">L’attaque HTTP Flood (Layer 7 DDoS) cible la couche application du modèle OSI. Contrairement aux attaques volumétriques, elle vise à épuiser les ressources applicatives du serveur (CPU, mémoire, connexions base de données). Des bots envoient des requêtes HTTP GET/POST en apparence légitimes, mais dont le volume agrégé finit par saturer le serveur. La difficulté de détection réside dans le fait que chaque requête individuelle est parfaitement valide.</w:t>
-      </w:r>
-    </w:p>
-    <w:p>
-      <w:pPr>
         <w:spacing w:after="140"/>
       </w:pPr>
     </w:p>
@@ -3564,7 +3358,281 @@
           <w:sz w:val="18"/>
           <w:szCs w:val="18"/>
         </w:rPr>
-        <w:t xml:space="preserve">Figure 4 — Attaque HTTP Flood en cours. Le nombre de requêtes HTTP par seconde s’envole, la charge CPU simulée atteint des niveaux critiques.</w:t>
+        <w:t xml:space="preserve">Figure 4 — Attaque par amplification DNS en cours. Les requêtes DNS forgées inondent le serveur avec un facteur d’amplification important.</w:t>
+      </w:r>
+    </w:p>
+    <w:p>
+      <w:pPr>
+        <w:pStyle w:val="Heading3"/>
+        <w:spacing w:after="80" w:before="200"/>
+      </w:pPr>
+      <w:r>
+        <w:rPr>
+          <w:rFonts w:ascii="Times New Roman" w:cs="Times New Roman" w:eastAsia="Times New Roman" w:hAnsi="Times New Roman"/>
+          <w:b/>
+          <w:bCs/>
+          <w:color w:val="1A1A1A"/>
+          <w:sz w:val="22"/>
+          <w:szCs w:val="22"/>
+        </w:rPr>
+        <w:t xml:space="preserve">Détection et prévention</w:t>
+      </w:r>
+    </w:p>
+    <w:p>
+      <w:pPr>
+        <w:pStyle w:val="ListParagraph"/>
+        <w:numPr>
+          <w:ilvl w:val="0"/>
+          <w:numId w:val="2"/>
+        </w:numPr>
+        <w:spacing w:after="30" w:before="30" w:line="300"/>
+      </w:pPr>
+      <w:r>
+        <w:rPr>
+          <w:rFonts w:ascii="Times New Roman" w:cs="Times New Roman" w:eastAsia="Times New Roman" w:hAnsi="Times New Roman"/>
+          <w:color w:val="1A1A1A"/>
+          <w:sz w:val="22"/>
+          <w:szCs w:val="22"/>
+        </w:rPr>
+        <w:t xml:space="preserve">Augmentation massive du trafic DNS en direction de la cible.</w:t>
+      </w:r>
+    </w:p>
+    <w:p>
+      <w:pPr>
+        <w:pStyle w:val="ListParagraph"/>
+        <w:numPr>
+          <w:ilvl w:val="0"/>
+          <w:numId w:val="2"/>
+        </w:numPr>
+        <w:spacing w:after="30" w:before="30" w:line="300"/>
+      </w:pPr>
+      <w:r>
+        <w:rPr>
+          <w:rFonts w:ascii="Times New Roman" w:cs="Times New Roman" w:eastAsia="Times New Roman" w:hAnsi="Times New Roman"/>
+          <w:color w:val="1A1A1A"/>
+          <w:sz w:val="22"/>
+          <w:szCs w:val="22"/>
+        </w:rPr>
+        <w:t xml:space="preserve">Réponses DNS sans requêtes correspondantes.</w:t>
+      </w:r>
+    </w:p>
+    <w:p>
+      <w:pPr>
+        <w:pStyle w:val="ListParagraph"/>
+        <w:numPr>
+          <w:ilvl w:val="0"/>
+          <w:numId w:val="2"/>
+        </w:numPr>
+        <w:spacing w:after="30" w:before="30" w:line="300"/>
+      </w:pPr>
+      <w:r>
+        <w:rPr>
+          <w:rFonts w:ascii="Times New Roman" w:cs="Times New Roman" w:eastAsia="Times New Roman" w:hAnsi="Times New Roman"/>
+          <w:color w:val="1A1A1A"/>
+          <w:sz w:val="22"/>
+          <w:szCs w:val="22"/>
+        </w:rPr>
+        <w:t xml:space="preserve">Paquets DNS de grande taille (requêtes ANY avec EDNS0).</w:t>
+      </w:r>
+    </w:p>
+    <w:p>
+      <w:pPr>
+        <w:pStyle w:val="ListParagraph"/>
+        <w:numPr>
+          <w:ilvl w:val="0"/>
+          <w:numId w:val="2"/>
+        </w:numPr>
+        <w:spacing w:after="30" w:before="30" w:line="300"/>
+      </w:pPr>
+      <w:r>
+        <w:rPr>
+          <w:rFonts w:ascii="Times New Roman" w:cs="Times New Roman" w:eastAsia="Times New Roman" w:hAnsi="Times New Roman"/>
+          <w:color w:val="1A1A1A"/>
+          <w:sz w:val="22"/>
+          <w:szCs w:val="22"/>
+        </w:rPr>
+        <w:t xml:space="preserve">Prévention : fermeture des résolveurs ouverts, filtrage BCP38, Response Rate Limiting, Anycast DNS.</w:t>
+      </w:r>
+    </w:p>
+    <w:p>
+      <w:pPr>
+        <w:pStyle w:val="Heading2"/>
+        <w:spacing w:after="120" w:before="280"/>
+      </w:pPr>
+      <w:r>
+        <w:rPr>
+          <w:rFonts w:ascii="Times New Roman" w:cs="Times New Roman" w:eastAsia="Times New Roman" w:hAnsi="Times New Roman"/>
+          <w:b/>
+          <w:bCs/>
+          <w:color w:val="415A77"/>
+          <w:sz w:val="26"/>
+          <w:szCs w:val="26"/>
+        </w:rPr>
+        <w:t xml:space="preserve">3.5 Attaque par fragmentation (Teardrop)</w:t>
+      </w:r>
+    </w:p>
+    <w:p>
+      <w:pPr>
+        <w:pStyle w:val="Heading3"/>
+        <w:spacing w:after="80" w:before="200"/>
+      </w:pPr>
+      <w:r>
+        <w:rPr>
+          <w:rFonts w:ascii="Times New Roman" w:cs="Times New Roman" w:eastAsia="Times New Roman" w:hAnsi="Times New Roman"/>
+          <w:b/>
+          <w:bCs/>
+          <w:color w:val="1A1A1A"/>
+          <w:sz w:val="22"/>
+          <w:szCs w:val="22"/>
+        </w:rPr>
+        <w:t xml:space="preserve">Principe technique</w:t>
+      </w:r>
+    </w:p>
+    <w:p>
+      <w:pPr>
+        <w:spacing w:after="100" w:before="40" w:line="320"/>
+        <w:jc w:val="both"/>
+      </w:pPr>
+      <w:r>
+        <w:rPr>
+          <w:rFonts w:ascii="Times New Roman" w:cs="Times New Roman" w:eastAsia="Times New Roman" w:hAnsi="Times New Roman"/>
+          <w:color w:val="1A1A1A"/>
+          <w:sz w:val="22"/>
+          <w:szCs w:val="22"/>
+        </w:rPr>
+        <w:t xml:space="preserve">L’attaque Teardrop exploite des vulnérabilités dans le réassemblage des fragments IP. L’attaquant envoie des fragments volontairement chevauchés (overlapping) ou mal ordonnancés. Certains systèmes d’exploitation anciens (noyaux Linux antérieurs à 2.0.33, Windows 95/NT) ne géraient pas correctement ces chevauchements et pouvaient planter (kernel panic) ou corrompre la mémoire.</w:t>
+      </w:r>
+    </w:p>
+    <w:p>
+      <w:pPr>
+        <w:spacing w:after="100" w:before="40" w:line="320"/>
+        <w:jc w:val="both"/>
+      </w:pPr>
+      <w:r>
+        <w:rPr>
+          <w:rFonts w:ascii="Times New Roman" w:cs="Times New Roman" w:eastAsia="Times New Roman" w:hAnsi="Times New Roman"/>
+          <w:color w:val="1A1A1A"/>
+          <w:sz w:val="22"/>
+          <w:szCs w:val="22"/>
+        </w:rPr>
+        <w:t xml:space="preserve">Les systèmes modernes ne sont plus vulnérables à cette attaque, qui conserve un intérêt principalement pédagogique. Les mesures de prévention incluent la mise à jour des systèmes et le filtrage des fragments anormaux au niveau du pare-feu.</w:t>
+      </w:r>
+    </w:p>
+    <w:p>
+      <w:pPr>
+        <w:pStyle w:val="Heading2"/>
+        <w:spacing w:after="120" w:before="280"/>
+      </w:pPr>
+      <w:r>
+        <w:rPr>
+          <w:rFonts w:ascii="Times New Roman" w:cs="Times New Roman" w:eastAsia="Times New Roman" w:hAnsi="Times New Roman"/>
+          <w:b/>
+          <w:bCs/>
+          <w:color w:val="415A77"/>
+          <w:sz w:val="26"/>
+          <w:szCs w:val="26"/>
+        </w:rPr>
+        <w:t xml:space="preserve">3.6 HTTP Flood</w:t>
+      </w:r>
+    </w:p>
+    <w:p>
+      <w:pPr>
+        <w:pStyle w:val="Heading3"/>
+        <w:spacing w:after="80" w:before="200"/>
+      </w:pPr>
+      <w:r>
+        <w:rPr>
+          <w:rFonts w:ascii="Times New Roman" w:cs="Times New Roman" w:eastAsia="Times New Roman" w:hAnsi="Times New Roman"/>
+          <w:b/>
+          <w:bCs/>
+          <w:color w:val="1A1A1A"/>
+          <w:sz w:val="22"/>
+          <w:szCs w:val="22"/>
+        </w:rPr>
+        <w:t xml:space="preserve">Principe technique</w:t>
+      </w:r>
+    </w:p>
+    <w:p>
+      <w:pPr>
+        <w:spacing w:after="100" w:before="40" w:line="320"/>
+        <w:jc w:val="both"/>
+      </w:pPr>
+      <w:r>
+        <w:rPr>
+          <w:rFonts w:ascii="Times New Roman" w:cs="Times New Roman" w:eastAsia="Times New Roman" w:hAnsi="Times New Roman"/>
+          <w:color w:val="1A1A1A"/>
+          <w:sz w:val="22"/>
+          <w:szCs w:val="22"/>
+        </w:rPr>
+        <w:t xml:space="preserve">L’attaque HTTP Flood (Layer 7 DDoS) cible la couche application du modèle OSI. Contrairement aux attaques volumétriques, elle vise à épuiser les ressources applicatives du serveur (CPU, mémoire, connexions base de données). Des bots envoient des requêtes HTTP GET/POST en apparence légitimes, mais dont le volume agrégé finit par saturer le serveur. La difficulté de détection réside dans le fait que chaque requête individuelle est parfaitement valide.</w:t>
+      </w:r>
+    </w:p>
+    <w:p>
+      <w:pPr>
+        <w:spacing w:after="140"/>
+      </w:pPr>
+    </w:p>
+    <w:p>
+      <w:pPr>
+        <w:spacing w:after="60" w:before="120"/>
+        <w:jc w:val="center"/>
+      </w:pPr>
+      <w:r>
+        <w:drawing>
+          <wp:inline distT="0" distB="0" distL="0" distR="0">
+            <wp:extent cx="7143750" cy="4019550"/>
+            <wp:effectExtent t="0" r="0" b="0" l="0"/>
+            <wp:docPr id="1" name="" descr="" title=""/>
+            <wp:cNvGraphicFramePr>
+              <a:graphicFrameLocks xmlns:a="http://schemas.openxmlformats.org/drawingml/2006/main" noChangeAspect="1"/>
+            </wp:cNvGraphicFramePr>
+            <a:graphic xmlns:a="http://schemas.openxmlformats.org/drawingml/2006/main">
+              <a:graphicData uri="http://schemas.openxmlformats.org/drawingml/2006/picture">
+                <pic:pic xmlns:pic="http://schemas.openxmlformats.org/drawingml/2006/picture">
+                  <pic:nvPicPr>
+                    <pic:cNvPr id="0" name="" descr=""/>
+                    <pic:cNvPicPr>
+                      <a:picLocks noChangeAspect="1" noChangeArrowheads="1"/>
+                    </pic:cNvPicPr>
+                  </pic:nvPicPr>
+                  <pic:blipFill>
+                    <a:blip r:embed="rId13" cstate="none"/>
+                    <a:srcRect/>
+                    <a:stretch>
+                      <a:fillRect/>
+                    </a:stretch>
+                  </pic:blipFill>
+                  <pic:spPr bwMode="auto">
+                    <a:xfrm>
+                      <a:off x="0" y="0"/>
+                      <a:ext cx="7143750" cy="4019550"/>
+                    </a:xfrm>
+                    <a:prstGeom prst="rect">
+                      <a:avLst/>
+                    </a:prstGeom>
+                  </pic:spPr>
+                </pic:pic>
+              </a:graphicData>
+            </a:graphic>
+          </wp:inline>
+        </w:drawing>
+      </w:r>
+    </w:p>
+    <w:p>
+      <w:pPr>
+        <w:spacing w:after="200" w:before="0"/>
+        <w:jc w:val="center"/>
+      </w:pPr>
+      <w:r>
+        <w:rPr>
+          <w:rFonts w:ascii="Times New Roman" w:cs="Times New Roman" w:eastAsia="Times New Roman" w:hAnsi="Times New Roman"/>
+          <w:i/>
+          <w:iCs/>
+          <w:color w:val="778DA9"/>
+          <w:sz w:val="18"/>
+          <w:szCs w:val="18"/>
+        </w:rPr>
+        <w:t xml:space="preserve">Figure 5 — Attaque HTTP Flood en cours. Le nombre de requêtes HTTP par seconde s’envole, la charge CPU simulée atteint des niveaux critiques.</w:t>
       </w:r>
     </w:p>
     <w:p>

</xml_diff>

<commit_message>
Ajout logo ISEP dans l'en-tete, suppression des traits separateurs
</commit_message>
<xml_diff>
--- a/Rapport_DDoS_NetSim.docx
+++ b/Rapport_DDoS_NetSim.docx
@@ -48,9 +48,6 @@
     </w:p>
     <w:p>
       <w:pPr>
-        <w:pBdr>
-          <w:bottom w:val="single" w:color="778DA9" w:sz="2" w:space="4"/>
-        </w:pBdr>
         <w:spacing w:after="0" w:before="0"/>
       </w:pPr>
     </w:p>
@@ -137,9 +134,6 @@
     <w:p>
       <w:pPr>
         <w:pStyle w:val="Heading1"/>
-        <w:pBdr>
-          <w:bottom w:val="single" w:color="415A77" w:sz="2" w:space="6"/>
-        </w:pBdr>
         <w:spacing w:after="200" w:before="400"/>
       </w:pPr>
       <w:r>
@@ -378,9 +372,6 @@
     <w:p>
       <w:pPr>
         <w:pStyle w:val="Heading1"/>
-        <w:pBdr>
-          <w:bottom w:val="single" w:color="415A77" w:sz="2" w:space="6"/>
-        </w:pBdr>
         <w:spacing w:after="200" w:before="400"/>
       </w:pPr>
       <w:r>
@@ -1132,9 +1123,6 @@
     <w:p>
       <w:pPr>
         <w:pStyle w:val="Heading1"/>
-        <w:pBdr>
-          <w:bottom w:val="single" w:color="415A77" w:sz="2" w:space="6"/>
-        </w:pBdr>
         <w:spacing w:after="200" w:before="400"/>
       </w:pPr>
       <w:r>
@@ -4200,9 +4188,6 @@
     <w:p>
       <w:pPr>
         <w:pStyle w:val="Heading1"/>
-        <w:pBdr>
-          <w:bottom w:val="single" w:color="415A77" w:sz="2" w:space="6"/>
-        </w:pBdr>
         <w:spacing w:after="200" w:before="400"/>
       </w:pPr>
       <w:r>
@@ -4993,9 +4978,6 @@
     <w:p>
       <w:pPr>
         <w:pStyle w:val="Heading1"/>
-        <w:pBdr>
-          <w:bottom w:val="single" w:color="415A77" w:sz="2" w:space="6"/>
-        </w:pBdr>
         <w:spacing w:after="200" w:before="400"/>
       </w:pPr>
       <w:r>
@@ -5968,9 +5950,6 @@
     <w:p>
       <w:pPr>
         <w:pStyle w:val="Heading1"/>
-        <w:pBdr>
-          <w:bottom w:val="single" w:color="415A77" w:sz="2" w:space="6"/>
-        </w:pBdr>
         <w:spacing w:after="200" w:before="400"/>
       </w:pPr>
       <w:r>
@@ -6428,9 +6407,6 @@
     <w:p>
       <w:pPr>
         <w:pStyle w:val="Heading1"/>
-        <w:pBdr>
-          <w:bottom w:val="single" w:color="415A77" w:sz="2" w:space="6"/>
-        </w:pBdr>
         <w:spacing w:after="200" w:before="400"/>
       </w:pPr>
       <w:r>
@@ -7089,9 +7065,6 @@
     <w:p>
       <w:pPr>
         <w:pStyle w:val="Heading1"/>
-        <w:pBdr>
-          <w:bottom w:val="single" w:color="415A77" w:sz="2" w:space="6"/>
-        </w:pBdr>
         <w:spacing w:after="200" w:before="400"/>
       </w:pPr>
       <w:r>
@@ -7850,14 +7823,6 @@
     </w:p>
     <w:p>
       <w:pPr>
-        <w:pBdr>
-          <w:top w:val="single" w:color="778DA9" w:sz="1" w:space="6"/>
-        </w:pBdr>
-        <w:spacing w:after="0" w:before="200"/>
-      </w:pPr>
-    </w:p>
-    <w:p>
-      <w:pPr>
         <w:spacing w:after="100" w:before="40" w:line="320"/>
         <w:jc w:val="both"/>
       </w:pPr>
@@ -7928,9 +7893,6 @@
 <w:ftr xmlns:wpc="http://schemas.microsoft.com/office/word/2010/wordprocessingCanvas" xmlns:mc="http://schemas.openxmlformats.org/markup-compatibility/2006" xmlns:o="urn:schemas-microsoft-com:office:office" xmlns:r="http://schemas.openxmlformats.org/officeDocument/2006/relationships" xmlns:m="http://schemas.openxmlformats.org/officeDocument/2006/math" xmlns:v="urn:schemas-microsoft-com:vml" xmlns:wp14="http://schemas.microsoft.com/office/word/2010/wordprocessingDrawing" xmlns:wp="http://schemas.openxmlformats.org/drawingml/2006/wordprocessingDrawing" xmlns:w10="urn:schemas-microsoft-com:office:word" xmlns:w="http://schemas.openxmlformats.org/wordprocessingml/2006/main" xmlns:w14="http://schemas.microsoft.com/office/word/2010/wordml" xmlns:w15="http://schemas.microsoft.com/office/word/2012/wordml" xmlns:wpg="http://schemas.microsoft.com/office/word/2010/wordprocessingGroup" xmlns:wpi="http://schemas.microsoft.com/office/word/2010/wordprocessingInk" xmlns:wne="http://schemas.microsoft.com/office/word/2006/wordml" xmlns:wps="http://schemas.microsoft.com/office/word/2010/wordprocessingShape">
   <w:p>
     <w:pPr>
-      <w:pBdr>
-        <w:top w:val="single" w:color="778DA9" w:sz="1" w:space="4"/>
-      </w:pBdr>
       <w:spacing w:before="60"/>
       <w:jc w:val="center"/>
     </w:pPr>
@@ -7998,26 +7960,122 @@
 
 <file path=word/header1.xml><?xml version="1.0" encoding="utf-8"?>
 <w:hdr xmlns:wpc="http://schemas.microsoft.com/office/word/2010/wordprocessingCanvas" xmlns:mc="http://schemas.openxmlformats.org/markup-compatibility/2006" xmlns:o="urn:schemas-microsoft-com:office:office" xmlns:r="http://schemas.openxmlformats.org/officeDocument/2006/relationships" xmlns:m="http://schemas.openxmlformats.org/officeDocument/2006/math" xmlns:v="urn:schemas-microsoft-com:vml" xmlns:wp14="http://schemas.microsoft.com/office/word/2010/wordprocessingDrawing" xmlns:wp="http://schemas.openxmlformats.org/drawingml/2006/wordprocessingDrawing" xmlns:w10="urn:schemas-microsoft-com:office:word" xmlns:w="http://schemas.openxmlformats.org/wordprocessingml/2006/main" xmlns:w14="http://schemas.microsoft.com/office/word/2010/wordml" xmlns:w15="http://schemas.microsoft.com/office/word/2012/wordml" xmlns:wpg="http://schemas.microsoft.com/office/word/2010/wordprocessingGroup" xmlns:wpi="http://schemas.microsoft.com/office/word/2010/wordprocessingInk" xmlns:wne="http://schemas.microsoft.com/office/word/2006/wordml" xmlns:wps="http://schemas.microsoft.com/office/word/2010/wordprocessingShape" xmlns:cx="http://schemas.microsoft.com/office/drawing/2014/chartex" xmlns:cx1="http://schemas.microsoft.com/office/drawing/2015/9/8/chartex" xmlns:cx2="http://schemas.microsoft.com/office/drawing/2015/10/21/chartex" xmlns:cx3="http://schemas.microsoft.com/office/drawing/2016/5/9/chartex" xmlns:cx4="http://schemas.microsoft.com/office/drawing/2016/5/10/chartex" xmlns:cx5="http://schemas.microsoft.com/office/drawing/2016/5/11/chartex" xmlns:cx6="http://schemas.microsoft.com/office/drawing/2016/5/12/chartex" xmlns:cx7="http://schemas.microsoft.com/office/drawing/2016/5/13/chartex" xmlns:cx8="http://schemas.microsoft.com/office/drawing/2016/5/14/chartex" xmlns:w16cid="http://schemas.microsoft.com/office/word/2016/wordml/cid" xmlns:w16se="http://schemas.microsoft.com/office/word/2015/wordml/symex">
-  <w:p>
-    <w:pPr>
-      <w:pBdr>
-        <w:bottom w:val="single" w:color="778DA9" w:sz="1" w:space="4"/>
-      </w:pBdr>
-      <w:spacing w:after="60"/>
-      <w:jc w:val="right"/>
-    </w:pPr>
-    <w:r>
-      <w:rPr>
-        <w:rFonts w:ascii="Times New Roman" w:cs="Times New Roman" w:eastAsia="Times New Roman" w:hAnsi="Times New Roman"/>
-        <w:i/>
-        <w:iCs/>
-        <w:color w:val="778DA9"/>
-        <w:sz w:val="16"/>
-        <w:szCs w:val="16"/>
-      </w:rPr>
-      <w:t xml:space="preserve">NetSim DDoS Lab</w:t>
-    </w:r>
-  </w:p>
+  <w:tbl>
+    <w:tblPr>
+      <w:tblW w:type="dxa" w:w="9072"/>
+      <w:tblBorders>
+        <w:top w:val="single" w:color="auto" w:sz="4"/>
+        <w:left w:val="single" w:color="auto" w:sz="4"/>
+        <w:bottom w:val="single" w:color="auto" w:sz="4"/>
+        <w:right w:val="single" w:color="auto" w:sz="4"/>
+        <w:insideH w:val="single" w:color="auto" w:sz="4"/>
+        <w:insideV w:val="single" w:color="auto" w:sz="4"/>
+      </w:tblBorders>
+    </w:tblPr>
+    <w:tblGrid>
+      <w:gridCol w:w="1200"/>
+      <w:gridCol w:w="7872"/>
+    </w:tblGrid>
+    <w:tr>
+      <w:tc>
+        <w:tcPr>
+          <w:tcW w:type="dxa" w:w="1200"/>
+          <w:tcBorders>
+            <w:top w:val="none" w:sz="0"/>
+            <w:left w:val="none" w:sz="0"/>
+            <w:bottom w:val="none" w:sz="0"/>
+            <w:right w:val="none" w:sz="0"/>
+          </w:tcBorders>
+          <w:tcMar>
+            <w:top w:type="dxa" w:w="0"/>
+            <w:left w:type="dxa" w:w="0"/>
+            <w:bottom w:type="dxa" w:w="0"/>
+            <w:right w:type="dxa" w:w="0"/>
+          </w:tcMar>
+        </w:tcPr>
+        <w:p>
+          <w:pPr>
+            <w:spacing w:after="0" w:before="0"/>
+            <w:jc w:val="left"/>
+          </w:pPr>
+          <w:r>
+            <w:drawing>
+              <wp:inline distT="0" distB="0" distL="0" distR="0">
+                <wp:extent cx="952500" cy="952500"/>
+                <wp:effectExtent t="0" r="0" b="0" l="0"/>
+                <wp:docPr id="1" name="" descr="" title=""/>
+                <wp:cNvGraphicFramePr>
+                  <a:graphicFrameLocks xmlns:a="http://schemas.openxmlformats.org/drawingml/2006/main" noChangeAspect="1"/>
+                </wp:cNvGraphicFramePr>
+                <a:graphic xmlns:a="http://schemas.openxmlformats.org/drawingml/2006/main">
+                  <a:graphicData uri="http://schemas.openxmlformats.org/drawingml/2006/picture">
+                    <pic:pic xmlns:pic="http://schemas.openxmlformats.org/drawingml/2006/picture">
+                      <pic:nvPicPr>
+                        <pic:cNvPr id="0" name="" descr=""/>
+                        <pic:cNvPicPr>
+                          <a:picLocks noChangeAspect="1" noChangeArrowheads="1"/>
+                        </pic:cNvPicPr>
+                      </pic:nvPicPr>
+                      <pic:blipFill>
+                        <a:blip r:embed="rId0" cstate="none"/>
+                        <a:srcRect/>
+                        <a:stretch>
+                          <a:fillRect/>
+                        </a:stretch>
+                      </pic:blipFill>
+                      <pic:spPr bwMode="auto">
+                        <a:xfrm>
+                          <a:off x="0" y="0"/>
+                          <a:ext cx="952500" cy="952500"/>
+                        </a:xfrm>
+                        <a:prstGeom prst="rect">
+                          <a:avLst/>
+                        </a:prstGeom>
+                      </pic:spPr>
+                    </pic:pic>
+                  </a:graphicData>
+                </a:graphic>
+              </wp:inline>
+            </w:drawing>
+          </w:r>
+        </w:p>
+      </w:tc>
+      <w:tc>
+        <w:tcPr>
+          <w:tcW w:type="dxa" w:w="7872"/>
+          <w:tcBorders>
+            <w:top w:val="none" w:sz="0"/>
+            <w:left w:val="none" w:sz="0"/>
+            <w:bottom w:val="none" w:sz="0"/>
+            <w:right w:val="none" w:sz="0"/>
+          </w:tcBorders>
+          <w:tcMar>
+            <w:top w:type="dxa" w:w="0"/>
+            <w:left w:type="dxa" w:w="0"/>
+            <w:bottom w:type="dxa" w:w="0"/>
+            <w:right w:type="dxa" w:w="0"/>
+          </w:tcMar>
+        </w:tcPr>
+        <w:p>
+          <w:pPr>
+            <w:spacing w:after="0" w:before="0"/>
+            <w:jc w:val="right"/>
+          </w:pPr>
+          <w:r>
+            <w:rPr>
+              <w:rFonts w:ascii="Times New Roman" w:cs="Times New Roman" w:eastAsia="Times New Roman" w:hAnsi="Times New Roman"/>
+              <w:i/>
+              <w:iCs/>
+              <w:color w:val="778DA9"/>
+              <w:sz w:val="16"/>
+              <w:szCs w:val="16"/>
+            </w:rPr>
+            <w:t xml:space="preserve">NetSim DDoS Lab — ISEP 2025–2026</w:t>
+          </w:r>
+        </w:p>
+      </w:tc>
+    </w:tr>
+  </w:tbl>
 </w:hdr>
 </file>
 

</xml_diff>

<commit_message>
Rapport humanise : ton personnel, retour d'experience, sections IA condensees
</commit_message>
<xml_diff>
--- a/Rapport_DDoS_NetSim.docx
+++ b/Rapport_DDoS_NetSim.docx
@@ -160,7 +160,7 @@
           <w:sz w:val="22"/>
           <w:szCs w:val="22"/>
         </w:rPr>
-        <w:t xml:space="preserve">Une attaque par déni de service distribué (DDoS) vise à rendre une ressource informatique indisponible pour ses utilisateurs légitimes en la submergeant de trafic malveillant provenant de multiples sources simultanées.</w:t>
+        <w:t xml:space="preserve">Quand on nous a proposé ce sujet de projet sur les attaques DDoS, on a tout de suite été motivés. C’est un sujet dont on entend beaucoup parler dans l’actualité -- les cyberattaques contre les hôpitaux, les administrations, les sites e-commerce -- mais qu’on n’avait jamais eu l’occasion d’étudier concrètement. L’idée de construire notre propre simulateur pour voir les mécanismes « de l’intérieur » nous a tout de suite parlé.</w:t>
       </w:r>
     </w:p>
     <w:p>
@@ -175,7 +175,7 @@
           <w:sz w:val="22"/>
           <w:szCs w:val="22"/>
         </w:rPr>
-        <w:t xml:space="preserve">Contrairement à une attaque DoS classique reposant sur une source unique, l’attaque DDoS exploite un botnet, c’est-à-dire un réseau de machines compromises — ordinateurs, serveurs ou objets connectés — pour générer un volume de requêtes bien au-delà de ce qu’une seule machine pourrait produire.</w:t>
+        <w:t xml:space="preserve">Une attaque par déni de service distribué (DDoS) vise à rendre une ressource informatique indisponible en la submergeant de trafic malveillant provenant de multiples sources. Concrètement, au lieu d’un seul attaquant, on parle d’un botnet -- tout un réseau de machines compromises qui attaquent en même temps.</w:t>
       </w:r>
     </w:p>
     <w:p>
@@ -190,7 +190,7 @@
           <w:sz w:val="22"/>
           <w:szCs w:val="22"/>
         </w:rPr>
-        <w:t xml:space="preserve">Ce projet met en œuvre un simulateur réseau interactif permettant de visualiser en temps réel le comportement de différentes attaques DDoS et leur impact sur l’infrastructure cible, dans une perspective strictement pédagogique.</w:t>
+        <w:t xml:space="preserve">On a développé un simulateur interactif qui permet de visualiser en temps réel comment se comportent différents types d’attaques DDoS et quel impact elles ont sur un serveur cible. Le but est purement pédagogique -- comprendre le fonctionnement pour mieux savoir se défendre.</w:t>
       </w:r>
     </w:p>
     <w:p>
@@ -258,7 +258,7 @@
           <w:sz w:val="18"/>
           <w:szCs w:val="18"/>
         </w:rPr>
-        <w:t xml:space="preserve">Figure 1 — Interface principale du simulateur NetSim DDoS Lab. La topologie réseau s’affiche au centre, les métriques en temps réel à droite, et le panneau de contrôle des attaques en haut.</w:t>
+        <w:t xml:space="preserve">Figure 1 — Interface principale du simulateur NetSim DDoS Lab. La topologie reseau s’affiche au centre, les metriques en temps reel a droite, le panneau de controle des attaques en haut.</w:t>
       </w:r>
     </w:p>
     <w:p>
@@ -290,7 +290,101 @@
           <w:sz w:val="22"/>
           <w:szCs w:val="22"/>
         </w:rPr>
-        <w:t xml:space="preserve">Selon le CERT-FR (CERTFR-2026-CTI-002) et le guide de l’ANSSI sur les attaques DDoS, plusieurs tendances majeures caractérisent le paysage actuel des menaces :</w:t>
+        <w:t xml:space="preserve">D’après ce qu’on a pu lire dans les rapports du CERT-FR et les guides de l’ANSSI, les attaques DDoS sont de plus en plus fréquentes et puissantes -- on parle régulièrement de plusieurs térabit par seconde désormais. Les motivations sont variées : racket, politique, ou simple test de la part de hackers qui veulent voir jusqu’où ils peuvent aller. La France est d’ailleurs l’un des pays les plus ciblés en Europe.</w:t>
+      </w:r>
+    </w:p>
+    <w:p>
+      <w:pPr>
+        <w:spacing w:after="100" w:before="40" w:line="320"/>
+        <w:jc w:val="both"/>
+      </w:pPr>
+      <w:r>
+        <w:rPr>
+          <w:rFonts w:ascii="Times New Roman" w:cs="Times New Roman" w:eastAsia="Times New Roman" w:hAnsi="Times New Roman"/>
+          <w:color w:val="1A1A1A"/>
+          <w:sz w:val="22"/>
+          <w:szCs w:val="22"/>
+        </w:rPr>
+        <w:t xml:space="preserve">D’ailleurs, pendant nos recherches, on est tombé sur des chiffres qui nous ont marqués : le coût moyen d’une attaque DDoS pour une entreprise peut dépasser le million d’euros quand on compte la perte de chiffre d’affaires, les rançons et les coûts de remise en route.</w:t>
+      </w:r>
+    </w:p>
+    <w:p>
+      <w:pPr>
+        <w:pStyle w:val="Heading1"/>
+        <w:spacing w:after="200" w:before="400"/>
+      </w:pPr>
+      <w:r>
+        <w:rPr>
+          <w:rFonts w:ascii="Times New Roman" w:cs="Times New Roman" w:eastAsia="Times New Roman" w:hAnsi="Times New Roman"/>
+          <w:b/>
+          <w:bCs/>
+          <w:color w:val="1B263B"/>
+          <w:sz w:val="32"/>
+          <w:szCs w:val="32"/>
+        </w:rPr>
+        <w:t xml:space="preserve">2. Architecture du simulateur</w:t>
+      </w:r>
+    </w:p>
+    <w:p>
+      <w:pPr>
+        <w:spacing w:after="100" w:before="40" w:line="320"/>
+        <w:jc w:val="both"/>
+      </w:pPr>
+      <w:r>
+        <w:rPr>
+          <w:rFonts w:ascii="Times New Roman" w:cs="Times New Roman" w:eastAsia="Times New Roman" w:hAnsi="Times New Roman"/>
+          <w:color w:val="1A1A1A"/>
+          <w:sz w:val="22"/>
+          <w:szCs w:val="22"/>
+        </w:rPr>
+        <w:t xml:space="preserve">Le simulateur NetSim DDoS est construit autour d’un moteur de simulation réseau en JavaScript (Node.js). On a choisi cette techno parce qu’on la maîtrisait déjà un peu et que Socket.IO -- la librairie qu’on utilise pour le temps réel -- est super bien documentée.</w:t>
+      </w:r>
+    </w:p>
+    <w:p>
+      <w:pPr>
+        <w:spacing w:after="100" w:before="40" w:line="320"/>
+        <w:jc w:val="both"/>
+      </w:pPr>
+      <w:r>
+        <w:rPr>
+          <w:rFonts w:ascii="Times New Roman" w:cs="Times New Roman" w:eastAsia="Times New Roman" w:hAnsi="Times New Roman"/>
+          <w:color w:val="1A1A1A"/>
+          <w:sz w:val="22"/>
+          <w:szCs w:val="22"/>
+        </w:rPr>
+        <w:t xml:space="preserve">Le premier défi technique qu’on a rencontré, c’était de faire communiquer le navigateur et le serveur en temps réel. On a hésité entre utiliser des requêtes HTTP classiques (polling) ou passer par WebSocket. Socket.IO était un bon compromis : il gère la reconnexion automatique et utilise WebSocket quand c’est disponible, avec un fallback polling si nécessaire. Pratique quand on développe sur un VPS.</w:t>
+      </w:r>
+    </w:p>
+    <w:p>
+      <w:pPr>
+        <w:spacing w:after="100" w:before="40" w:line="320"/>
+        <w:jc w:val="both"/>
+      </w:pPr>
+      <w:r>
+        <w:rPr>
+          <w:rFonts w:ascii="Times New Roman" w:cs="Times New Roman" w:eastAsia="Times New Roman" w:hAnsi="Times New Roman"/>
+          <w:color w:val="1A1A1A"/>
+          <w:sz w:val="22"/>
+          <w:szCs w:val="22"/>
+        </w:rPr>
+        <w:t xml:space="preserve">Ce qui nous a posé le plus de problèmes, c’est la synchronisation des animations avec les données réseau. Les paquets animés sur le canvas doivent correspondre aux métriques qu’on affiche à côté -- si le décalage est trop grand, on perd l’effet pédagogique. On a fini par trouver un rythme de « tick » à 100 ms qui marche bien.</w:t>
+      </w:r>
+    </w:p>
+    <w:p>
+      <w:pPr>
+        <w:pStyle w:val="Heading2"/>
+        <w:spacing w:after="120" w:before="280"/>
+      </w:pPr>
+      <w:r>
+        <w:rPr>
+          <w:rFonts w:ascii="Times New Roman" w:cs="Times New Roman" w:eastAsia="Times New Roman" w:hAnsi="Times New Roman"/>
+          <w:b/>
+          <w:bCs/>
+          <w:color w:val="415A77"/>
+          <w:sz w:val="26"/>
+          <w:szCs w:val="26"/>
+        </w:rPr>
+        <w:t xml:space="preserve">2.1 Topologie simulée</w:t>
       </w:r>
     </w:p>
     <w:p>
@@ -309,7 +403,7 @@
           <w:sz w:val="22"/>
           <w:szCs w:val="22"/>
         </w:rPr>
-        <w:t xml:space="preserve">Le volume des attaques DDoS ne cesse de croître, dépassant régulièrement le térabit par seconde.</w:t>
+        <w:t xml:space="preserve">Deux postes clients (PC1, PC2) qui génèrent du trafic légitime : requêtes HTTP, paquets ARP, requêtes DNS.</w:t>
       </w:r>
     </w:p>
     <w:p>
@@ -328,7 +422,7 @@
           <w:sz w:val="22"/>
           <w:szCs w:val="22"/>
         </w:rPr>
-        <w:t xml:space="preserve">Les motivations sont variées : cybercriminalité avec demande de rançon, hacktivisme, déstabilisation d’acteurs publics ou privés, et parfois simple test de capacité.</w:t>
+        <w:t xml:space="preserve">Un routeur central qui assure la commutation des paquets.</w:t>
       </w:r>
     </w:p>
     <w:p>
@@ -347,7 +441,7 @@
           <w:sz w:val="22"/>
           <w:szCs w:val="22"/>
         </w:rPr>
-        <w:t xml:space="preserve">Le coût moyen d’une attaque DDoS pour une entreprise est estimé entre 20 000 € et plusieurs millions d’euros.</w:t>
+        <w:t xml:space="preserve">Un serveur web -- c’est la cible des attaques.</w:t>
       </w:r>
     </w:p>
     <w:p>
@@ -366,39 +460,7 @@
           <w:sz w:val="22"/>
           <w:szCs w:val="22"/>
         </w:rPr>
-        <w:t xml:space="preserve">La France figure parmi les pays les plus ciblés en Europe.</w:t>
-      </w:r>
-    </w:p>
-    <w:p>
-      <w:pPr>
-        <w:pStyle w:val="Heading1"/>
-        <w:spacing w:after="200" w:before="400"/>
-      </w:pPr>
-      <w:r>
-        <w:rPr>
-          <w:rFonts w:ascii="Times New Roman" w:cs="Times New Roman" w:eastAsia="Times New Roman" w:hAnsi="Times New Roman"/>
-          <w:b/>
-          <w:bCs/>
-          <w:color w:val="1B263B"/>
-          <w:sz w:val="32"/>
-          <w:szCs w:val="32"/>
-        </w:rPr>
-        <w:t xml:space="preserve">2. Architecture du simulateur</w:t>
-      </w:r>
-    </w:p>
-    <w:p>
-      <w:pPr>
-        <w:spacing w:after="100" w:before="40" w:line="320"/>
-        <w:jc w:val="both"/>
-      </w:pPr>
-      <w:r>
-        <w:rPr>
-          <w:rFonts w:ascii="Times New Roman" w:cs="Times New Roman" w:eastAsia="Times New Roman" w:hAnsi="Times New Roman"/>
-          <w:color w:val="1A1A1A"/>
-          <w:sz w:val="22"/>
-          <w:szCs w:val="22"/>
-        </w:rPr>
-        <w:t xml:space="preserve">Le simulateur NetSim DDoS est construit autour d’un moteur de simulation réseau développé en JavaScript (Node.js). Il modélise une topologie réseau simplifiée, un générateur de trafic aléatoire et un système d’alertes en temps réel.</w:t>
+        <w:t xml:space="preserve">Un nœud attaquant qu’on peut activer pour déclencher les différents types d’attaques.</w:t>
       </w:r>
     </w:p>
     <w:p>
@@ -415,99 +477,6 @@
           <w:sz w:val="26"/>
           <w:szCs w:val="26"/>
         </w:rPr>
-        <w:t xml:space="preserve">2.1 Topologie simulée</w:t>
-      </w:r>
-    </w:p>
-    <w:p>
-      <w:pPr>
-        <w:pStyle w:val="ListParagraph"/>
-        <w:numPr>
-          <w:ilvl w:val="0"/>
-          <w:numId w:val="2"/>
-        </w:numPr>
-        <w:spacing w:after="30" w:before="30" w:line="300"/>
-      </w:pPr>
-      <w:r>
-        <w:rPr>
-          <w:rFonts w:ascii="Times New Roman" w:cs="Times New Roman" w:eastAsia="Times New Roman" w:hAnsi="Times New Roman"/>
-          <w:color w:val="1A1A1A"/>
-          <w:sz w:val="22"/>
-          <w:szCs w:val="22"/>
-        </w:rPr>
-        <w:t xml:space="preserve">Deux postes clients (PC1, PC2) générant du trafic légitime : requêtes HTTP, paquets ARP, requêtes DNS.</w:t>
-      </w:r>
-    </w:p>
-    <w:p>
-      <w:pPr>
-        <w:pStyle w:val="ListParagraph"/>
-        <w:numPr>
-          <w:ilvl w:val="0"/>
-          <w:numId w:val="2"/>
-        </w:numPr>
-        <w:spacing w:after="30" w:before="30" w:line="300"/>
-      </w:pPr>
-      <w:r>
-        <w:rPr>
-          <w:rFonts w:ascii="Times New Roman" w:cs="Times New Roman" w:eastAsia="Times New Roman" w:hAnsi="Times New Roman"/>
-          <w:color w:val="1A1A1A"/>
-          <w:sz w:val="22"/>
-          <w:szCs w:val="22"/>
-        </w:rPr>
-        <w:t xml:space="preserve">Un routeur central assurant la commutation des paquets entre les nœuds.</w:t>
-      </w:r>
-    </w:p>
-    <w:p>
-      <w:pPr>
-        <w:pStyle w:val="ListParagraph"/>
-        <w:numPr>
-          <w:ilvl w:val="0"/>
-          <w:numId w:val="2"/>
-        </w:numPr>
-        <w:spacing w:after="30" w:before="30" w:line="300"/>
-      </w:pPr>
-      <w:r>
-        <w:rPr>
-          <w:rFonts w:ascii="Times New Roman" w:cs="Times New Roman" w:eastAsia="Times New Roman" w:hAnsi="Times New Roman"/>
-          <w:color w:val="1A1A1A"/>
-          <w:sz w:val="22"/>
-          <w:szCs w:val="22"/>
-        </w:rPr>
-        <w:t xml:space="preserve">Un serveur web constituant la cible des attaques.</w:t>
-      </w:r>
-    </w:p>
-    <w:p>
-      <w:pPr>
-        <w:pStyle w:val="ListParagraph"/>
-        <w:numPr>
-          <w:ilvl w:val="0"/>
-          <w:numId w:val="2"/>
-        </w:numPr>
-        <w:spacing w:after="30" w:before="30" w:line="300"/>
-      </w:pPr>
-      <w:r>
-        <w:rPr>
-          <w:rFonts w:ascii="Times New Roman" w:cs="Times New Roman" w:eastAsia="Times New Roman" w:hAnsi="Times New Roman"/>
-          <w:color w:val="1A1A1A"/>
-          <w:sz w:val="22"/>
-          <w:szCs w:val="22"/>
-        </w:rPr>
-        <w:t xml:space="preserve">Un nœud attaquant pouvant être activé pour déclencher les différents types d’attaques.</w:t>
-      </w:r>
-    </w:p>
-    <w:p>
-      <w:pPr>
-        <w:pStyle w:val="Heading2"/>
-        <w:spacing w:after="120" w:before="280"/>
-      </w:pPr>
-      <w:r>
-        <w:rPr>
-          <w:rFonts w:ascii="Times New Roman" w:cs="Times New Roman" w:eastAsia="Times New Roman" w:hAnsi="Times New Roman"/>
-          <w:b/>
-          <w:bCs/>
-          <w:color w:val="415A77"/>
-          <w:sz w:val="26"/>
-          <w:szCs w:val="26"/>
-        </w:rPr>
         <w:t xml:space="preserve">2.2 Métriques en temps réel</w:t>
       </w:r>
     </w:p>
@@ -523,7 +492,7 @@
           <w:sz w:val="22"/>
           <w:szCs w:val="22"/>
         </w:rPr>
-        <w:t xml:space="preserve">Le moteur calcule et expose en continu un ensemble de métriques permettant d’évaluer l’état du réseau :</w:t>
+        <w:t xml:space="preserve">On a dû choisir quelles métriques afficher pour que ce soit utile sans être noyé d’informations. Voici ce qu’on a retenu :</w:t>
       </w:r>
     </w:p>
     <w:p>
@@ -1090,6 +1059,23 @@
     </w:p>
     <w:p>
       <w:pPr>
+        <w:pStyle w:val="Heading1"/>
+        <w:spacing w:after="200" w:before="400"/>
+      </w:pPr>
+      <w:r>
+        <w:rPr>
+          <w:rFonts w:ascii="Times New Roman" w:cs="Times New Roman" w:eastAsia="Times New Roman" w:hAnsi="Times New Roman"/>
+          <w:b/>
+          <w:bCs/>
+          <w:color w:val="1B263B"/>
+          <w:sz w:val="32"/>
+          <w:szCs w:val="32"/>
+        </w:rPr>
+        <w:t xml:space="preserve">3. Attaques DDoS implémentées</w:t>
+      </w:r>
+    </w:p>
+    <w:p>
+      <w:pPr>
         <w:pStyle w:val="Heading2"/>
         <w:spacing w:after="120" w:before="280"/>
       </w:pPr>
@@ -1102,7 +1088,24 @@
           <w:sz w:val="26"/>
           <w:szCs w:val="26"/>
         </w:rPr>
-        <w:t xml:space="preserve">2.3 Flux de données</w:t>
+        <w:t xml:space="preserve">3.1 SYN Flood</w:t>
+      </w:r>
+    </w:p>
+    <w:p>
+      <w:pPr>
+        <w:pStyle w:val="Heading3"/>
+        <w:spacing w:after="80" w:before="200"/>
+      </w:pPr>
+      <w:r>
+        <w:rPr>
+          <w:rFonts w:ascii="Times New Roman" w:cs="Times New Roman" w:eastAsia="Times New Roman" w:hAnsi="Times New Roman"/>
+          <w:b/>
+          <w:bCs/>
+          <w:color w:val="1A1A1A"/>
+          <w:sz w:val="22"/>
+          <w:szCs w:val="22"/>
+        </w:rPr>
+        <w:t xml:space="preserve">Principe technique</w:t>
       </w:r>
     </w:p>
     <w:p>
@@ -1117,58 +1120,7 @@
           <w:sz w:val="22"/>
           <w:szCs w:val="22"/>
         </w:rPr>
-        <w:t xml:space="preserve">Le système repose sur une architecture client-serveur temps réel. Les clients web (navigateurs) se connectent via Socket.IO et reçoivent en continu l’état de la simulation. Le moteur gère la génération du trafic normal et d’attaque, et un système de détection basé sur des seuils émet des alertes en fonction du niveau de saturation.</w:t>
-      </w:r>
-    </w:p>
-    <w:p>
-      <w:pPr>
-        <w:pStyle w:val="Heading1"/>
-        <w:spacing w:after="200" w:before="400"/>
-      </w:pPr>
-      <w:r>
-        <w:rPr>
-          <w:rFonts w:ascii="Times New Roman" w:cs="Times New Roman" w:eastAsia="Times New Roman" w:hAnsi="Times New Roman"/>
-          <w:b/>
-          <w:bCs/>
-          <w:color w:val="1B263B"/>
-          <w:sz w:val="32"/>
-          <w:szCs w:val="32"/>
-        </w:rPr>
-        <w:t xml:space="preserve">3. Attaques DDoS implémentées</w:t>
-      </w:r>
-    </w:p>
-    <w:p>
-      <w:pPr>
-        <w:pStyle w:val="Heading2"/>
-        <w:spacing w:after="120" w:before="280"/>
-      </w:pPr>
-      <w:r>
-        <w:rPr>
-          <w:rFonts w:ascii="Times New Roman" w:cs="Times New Roman" w:eastAsia="Times New Roman" w:hAnsi="Times New Roman"/>
-          <w:b/>
-          <w:bCs/>
-          <w:color w:val="415A77"/>
-          <w:sz w:val="26"/>
-          <w:szCs w:val="26"/>
-        </w:rPr>
-        <w:t xml:space="preserve">3.1 Syn Flood</w:t>
-      </w:r>
-    </w:p>
-    <w:p>
-      <w:pPr>
-        <w:pStyle w:val="Heading3"/>
-        <w:spacing w:after="80" w:before="200"/>
-      </w:pPr>
-      <w:r>
-        <w:rPr>
-          <w:rFonts w:ascii="Times New Roman" w:cs="Times New Roman" w:eastAsia="Times New Roman" w:hAnsi="Times New Roman"/>
-          <w:b/>
-          <w:bCs/>
-          <w:color w:val="1A1A1A"/>
-          <w:sz w:val="22"/>
-          <w:szCs w:val="22"/>
-        </w:rPr>
-        <w:t xml:space="preserve">Principe technique</w:t>
+        <w:t xml:space="preserve">L’attaque SYN Flood exploite le handshake TCP en trois étapes. En temps normal, le client envoie un SYN, le serveur répond par SYN-ACK en réservant une place dans sa file d’attente, et le client termine par un ACK. Là, l’attaquant envoie des milliers de SYN avec des adresses IP forgées, et le serveur se retrouve à attendre des ACK qui n’arriveront jamais. Résultat : la file d’attente se sature en quelques secondes.</w:t>
       </w:r>
     </w:p>
     <w:p>
@@ -1183,22 +1135,7 @@
           <w:sz w:val="22"/>
           <w:szCs w:val="22"/>
         </w:rPr>
-        <w:t xml:space="preserve">L’attaque SYN Flood exploite le mécanisme d’établissement de connexion TCP en trois étapes (three-way handshake). Dans une connexion légitime, le client envoie un paquet SYN, le serveur répond par un SYN-ACK en allouant une entrée dans sa file d’attente, puis le client finalise l’échange avec un ACK. Lors d’une attaque SYN Flood, l’attaquant envoie un flux massif de paquets SYN avec des adresses IP source forgées (spoofing). Le serveur répond à chaque SYN par un SYN-ACK vers une adresse qui n’existe pas, et les entrées restent dans le backlog jusqu’à expiration du délai. La file d’attente se sature, empêchant toute nouvelle connexion légitime.</w:t>
-      </w:r>
-    </w:p>
-    <w:p>
-      <w:pPr>
-        <w:spacing w:after="100" w:before="40" w:line="320"/>
-        <w:jc w:val="both"/>
-      </w:pPr>
-      <w:r>
-        <w:rPr>
-          <w:rFonts w:ascii="Times New Roman" w:cs="Times New Roman" w:eastAsia="Times New Roman" w:hAnsi="Times New Roman"/>
-          <w:color w:val="1A1A1A"/>
-          <w:sz w:val="22"/>
-          <w:szCs w:val="22"/>
-        </w:rPr>
-        <w:t xml:space="preserve">Les SYN cookies (RFC 4987) constituent la méthode de mitigation la plus répandue : le noyau répond aux SYN sans allouer d’entrée dans le backlog tant que l’ACK n’est pas reçu.</w:t>
+        <w:t xml:space="preserve">Quand on a lancé l’attaque pour la première fois, on a été vraiment surpris de voir à quelle vitesse le backlog saturait -- en moins de trois secondes, la file était pleine et les connexions légitimes étaient refusées. Ça donne une idée de l’efficacité redoutable de cette technique.</w:t>
       </w:r>
     </w:p>
     <w:p>
@@ -1266,7 +1203,7 @@
           <w:sz w:val="18"/>
           <w:szCs w:val="18"/>
         </w:rPr>
-        <w:t xml:space="preserve">Figure 2 — Attaque SYN Flood en cours. Le backlog de connexions augmente rapidement, la bande passante sature et les alertes de détection s’activent.</w:t>
+        <w:t xml:space="preserve">Figure 2 — Attaque SYN Flood en cours. Le backlog de connexions augmente rapidement, la bande passante sature et les alertes de detection s’activent.</w:t>
       </w:r>
     </w:p>
     <w:p>
@@ -1302,7 +1239,7 @@
           <w:sz w:val="22"/>
           <w:szCs w:val="22"/>
         </w:rPr>
-        <w:t xml:space="preserve">Pic anormal de paquets SYN (plusieurs milliers par seconde).</w:t>
+        <w:t xml:space="preserve">Pic de paquets SYN -- plusieurs milliers par seconde alors que d’habitude on en a quelques dizaines.</w:t>
       </w:r>
     </w:p>
     <w:p>
@@ -1321,7 +1258,7 @@
           <w:sz w:val="22"/>
           <w:szCs w:val="22"/>
         </w:rPr>
-        <w:t xml:space="preserve">Déséquilibre entre SYN entrants et ACK reçus.</w:t>
+        <w:t xml:space="preserve">Déséquilibre flagrant entre le nombre de SYN entrants et les ACK reçus.</w:t>
       </w:r>
     </w:p>
     <w:p>
@@ -1340,26 +1277,7 @@
           <w:sz w:val="22"/>
           <w:szCs w:val="22"/>
         </w:rPr>
-        <w:t xml:space="preserve">Backlog proche de la saturation.</w:t>
-      </w:r>
-    </w:p>
-    <w:p>
-      <w:pPr>
-        <w:pStyle w:val="ListParagraph"/>
-        <w:numPr>
-          <w:ilvl w:val="0"/>
-          <w:numId w:val="2"/>
-        </w:numPr>
-        <w:spacing w:after="30" w:before="30" w:line="300"/>
-      </w:pPr>
-      <w:r>
-        <w:rPr>
-          <w:rFonts w:ascii="Times New Roman" w:cs="Times New Roman" w:eastAsia="Times New Roman" w:hAnsi="Times New Roman"/>
-          <w:color w:val="1A1A1A"/>
-          <w:sz w:val="22"/>
-          <w:szCs w:val="22"/>
-        </w:rPr>
-        <w:t xml:space="preserve">Messages « possible SYN flooding » dans les logs système.</w:t>
+        <w:t xml:space="preserve">Backlog proche de la saturation -- c’est le signe le plus visuel dans notre simulateur.</w:t>
       </w:r>
     </w:p>
     <w:p>
@@ -1529,7 +1447,7 @@
                 <w:sz w:val="20"/>
                 <w:szCs w:val="20"/>
               </w:rPr>
-              <w:t xml:space="preserve">Activation au niveau noyau (net.ipv4.tcp_syncookies=1). Aucune allocation avant ACK.</w:t>
+              <w:t xml:space="preserve">Le noyau ne réserve pas de place avant d’avoir reçu l’ACK. Très efficace.</w:t>
             </w:r>
           </w:p>
         </w:tc>
@@ -1595,7 +1513,7 @@
                 <w:sz w:val="20"/>
                 <w:szCs w:val="20"/>
               </w:rPr>
-              <w:t xml:space="preserve">Augmentation de tcp_max_syn_backlog et somaxconn.</w:t>
+              <w:t xml:space="preserve">On peut augmenter tcp_max_syn_backlog et somaxconn pour gagner du temps.</w:t>
             </w:r>
           </w:p>
         </w:tc>
@@ -1661,7 +1579,7 @@
                 <w:sz w:val="20"/>
                 <w:szCs w:val="20"/>
               </w:rPr>
-              <w:t xml:space="preserve">Limitation du nombre de SYN par seconde par IP source.</w:t>
+              <w:t xml:space="preserve">Limiter le nombre de SYN par seconde et par IP source.</w:t>
             </w:r>
           </w:p>
         </w:tc>
@@ -1727,7 +1645,7 @@
                 <w:sz w:val="20"/>
                 <w:szCs w:val="20"/>
               </w:rPr>
-              <w:t xml:space="preserve">Cloudflare, AWS Shield, Akamai absorbent le trafic en amont.</w:t>
+              <w:t xml:space="preserve">Cloudflare, AWS Shield absorbent le trafic avant qu’il n’arrive au serveur.</w:t>
             </w:r>
           </w:p>
         </w:tc>
@@ -1784,7 +1702,22 @@
           <w:sz w:val="22"/>
           <w:szCs w:val="22"/>
         </w:rPr>
-        <w:t xml:space="preserve">Le port scan n’est pas une attaque DDoS au sens strict, mais une technique de reconnaissance fréquemment employée en amont pour identifier les services vulnérables. Les types de scans les plus courants sont : le SYN scan (half-open), le Connect scan, l’UDP scan, et les scans FIN/NULL/Xmas. Dans un contexte DDoS, un port scan distribué permet de cartographier l’infrastructure et d’identifier ses points faibles sans déclencher les détections.</w:t>
+        <w:t xml:space="preserve">Le port scan n’est pas une attaque DDoS en soi, mais plutôt une technique de reconnaissance qu’on utilise en amont pour repérer les failles. Les types les plus courants sont le SYN scan (half-open), le connect scan, l’UDP scan, et les scans FIN/NULL/Xmas qui utilisent des combinaisons de flags bizarres pour tromper les pare-feux.</w:t>
+      </w:r>
+    </w:p>
+    <w:p>
+      <w:pPr>
+        <w:spacing w:after="100" w:before="40" w:line="320"/>
+        <w:jc w:val="both"/>
+      </w:pPr>
+      <w:r>
+        <w:rPr>
+          <w:rFonts w:ascii="Times New Roman" w:cs="Times New Roman" w:eastAsia="Times New Roman" w:hAnsi="Times New Roman"/>
+          <w:color w:val="1A1A1A"/>
+          <w:sz w:val="22"/>
+          <w:szCs w:val="22"/>
+        </w:rPr>
+        <w:t xml:space="preserve">Dans un contexte DDoS, le port scan distribué permet de cartographier l’infrastructure cible sans se faire repérer -- chaque bot ne scanne qu’une petite partie.</w:t>
       </w:r>
     </w:p>
     <w:p>
@@ -1922,7 +1855,7 @@
                 <w:sz w:val="20"/>
                 <w:szCs w:val="20"/>
               </w:rPr>
-              <w:t xml:space="preserve">Analyse des connexions incomplètes</w:t>
+              <w:t xml:space="preserve">Connexions incomplètes (SYN sans ACK)</w:t>
             </w:r>
           </w:p>
         </w:tc>
@@ -1954,7 +1887,7 @@
                 <w:sz w:val="20"/>
                 <w:szCs w:val="20"/>
               </w:rPr>
-              <w:t xml:space="preserve">Pare-feu restrictif bloquant les ports non nécessaires</w:t>
+              <w:t xml:space="preserve">Pare-feu restrictif</w:t>
             </w:r>
           </w:p>
         </w:tc>
@@ -2143,7 +2076,22 @@
           <w:sz w:val="22"/>
           <w:szCs w:val="22"/>
         </w:rPr>
-        <w:t xml:space="preserve">L’attaque UDP Flood exploite le caractère sans état du protocole UDP : le serveur reçoit un datagramme et doit allouer des ressources pour le traiter sans pouvoir vérifier la légitimité de la source. L’attaquant envoie un grand nombre de datagrammes vers des ports aléatoires ou spécifiques. Le volume de paquets sature la bande passante et les ressources du serveur. Une variante courante est l’attaque par réflexion UDP, où l’attaquant utilise des services amplificateurs (NTP, SSDP) pour multiplier le trafic.</w:t>
+        <w:t xml:space="preserve">L’UDP Flood est redoutable parce que le protocole UDP n’a pas d’état -- le serveur reçoit un paquet et doit le traiter sans pouvoir vérifier d’où il vient. L’attaquant envoie des tonnes de datagrammes sur des ports aléatoires, et le serveur doit répondre avec des ICMP « Destination Unreachable » pour chaque paquet reçu sur un port fermé.</w:t>
+      </w:r>
+    </w:p>
+    <w:p>
+      <w:pPr>
+        <w:spacing w:after="100" w:before="40" w:line="320"/>
+        <w:jc w:val="both"/>
+      </w:pPr>
+      <w:r>
+        <w:rPr>
+          <w:rFonts w:ascii="Times New Roman" w:cs="Times New Roman" w:eastAsia="Times New Roman" w:hAnsi="Times New Roman"/>
+          <w:color w:val="1A1A1A"/>
+          <w:sz w:val="22"/>
+          <w:szCs w:val="22"/>
+        </w:rPr>
+        <w:t xml:space="preserve">Ce qu’on a trouvé intéressant en testant, c’est que l’UDP Flood fait rapidement grimper la bande passante à 100% alors que le CPU du serveur reste relativement bas -- ce qui rend l’attaque difficile à distinguer d’un pic de trafic normal pour quelqu’un qui ne regarde que la charge processeur.</w:t>
       </w:r>
     </w:p>
     <w:p>
@@ -2211,7 +2159,7 @@
           <w:sz w:val="18"/>
           <w:szCs w:val="18"/>
         </w:rPr>
-        <w:t xml:space="preserve">Figure 3 — Attaque UDP Flood en cours. Le nombre de datagrammes UDP par seconde explose, et la bande passante approche les 100 %.</w:t>
+        <w:t xml:space="preserve">Figure 3 — Attaque UDP Flood en cours. Le nombre de datagrammes UDP par seconde explose, la bande passante approche les 100%.</w:t>
       </w:r>
     </w:p>
     <w:p>
@@ -2481,7 +2429,7 @@
                 <w:sz w:val="20"/>
                 <w:szCs w:val="20"/>
               </w:rPr>
-              <w:t xml:space="preserve">Nombreux ICMP Unreachable</w:t>
+              <w:t xml:space="preserve">Nombreux ICMP Unreachable en sortie</w:t>
             </w:r>
           </w:p>
         </w:tc>
@@ -2636,7 +2584,22 @@
           <w:sz w:val="22"/>
           <w:szCs w:val="22"/>
         </w:rPr>
-        <w:t xml:space="preserve">L’attaque par amplification DNS exploite le facteur d’amplification des serveurs DNS ouverts. Une requête DNS de type ANY avec DNSSEC (environ 40 octets) peut générer une réponse de plusieurs milliers d’octets, soit un facteur d’amplification de 50 à 100 fois. En forgeant l’IP source pour qu’elle corresponde à celle de la victime, l’attaquant peut concentrer un trafic considérable sur sa cible.</w:t>
+        <w:t xml:space="preserve">L’amplification DNS, c’est un peu l’arme ultime des attaques par réflexion. L’idée est simple : envoyer une petite requête (40 octets) à un serveur DNS public en faisant croire qu’elle vient de la victime. Le serveur DNS répond alors à la victime avec une réponse 50 à 100 fois plus grosse. 40 octets envoyés, 4 000 reçus -- le ratio est impressionnant.</w:t>
+      </w:r>
+    </w:p>
+    <w:p>
+      <w:pPr>
+        <w:spacing w:after="100" w:before="40" w:line="320"/>
+        <w:jc w:val="both"/>
+      </w:pPr>
+      <w:r>
+        <w:rPr>
+          <w:rFonts w:ascii="Times New Roman" w:cs="Times New Roman" w:eastAsia="Times New Roman" w:hAnsi="Times New Roman"/>
+          <w:color w:val="1A1A1A"/>
+          <w:sz w:val="22"/>
+          <w:szCs w:val="22"/>
+        </w:rPr>
+        <w:t xml:space="preserve">Ce qui nous a le plus frappé en étudiant cette attaque, c’est qu’elle ne nécessite presque pas de ressources de la part de l’attaquant. Avec une petite connexion, on peut générer des dizaines de gigabits par seconde en exploitant des milliers de serveurs DNS mal configurés.</w:t>
       </w:r>
     </w:p>
     <w:p>
@@ -2878,7 +2841,7 @@
                 <w:sz w:val="20"/>
                 <w:szCs w:val="20"/>
               </w:rPr>
-              <w:t xml:space="preserve">50 à 100×</w:t>
+              <w:t xml:space="preserve">50 a 100x</w:t>
             </w:r>
           </w:p>
         </w:tc>
@@ -2976,7 +2939,7 @@
                 <w:sz w:val="20"/>
                 <w:szCs w:val="20"/>
               </w:rPr>
-              <w:t xml:space="preserve">Jusqu’à 556×</w:t>
+              <w:t xml:space="preserve">Jusqu’a 556x</w:t>
             </w:r>
           </w:p>
         </w:tc>
@@ -3074,7 +3037,7 @@
                 <w:sz w:val="20"/>
                 <w:szCs w:val="20"/>
               </w:rPr>
-              <w:t xml:space="preserve">Environ 30×</w:t>
+              <w:t xml:space="preserve">Environ 30x</w:t>
             </w:r>
           </w:p>
         </w:tc>
@@ -3172,7 +3135,7 @@
                 <w:sz w:val="20"/>
                 <w:szCs w:val="20"/>
               </w:rPr>
-              <w:t xml:space="preserve">Jusqu’à 50 000× (aujourd’hui mitigé)</w:t>
+              <w:t xml:space="preserve">Jusqu’a 50 000x (aujourd’hui mitige)</w:t>
             </w:r>
           </w:p>
         </w:tc>
@@ -3270,7 +3233,7 @@
                 <w:sz w:val="20"/>
                 <w:szCs w:val="20"/>
               </w:rPr>
-              <w:t xml:space="preserve">Environ 358×</w:t>
+              <w:t xml:space="preserve">Environ 358x</w:t>
             </w:r>
           </w:p>
         </w:tc>
@@ -3346,7 +3309,7 @@
           <w:sz w:val="18"/>
           <w:szCs w:val="18"/>
         </w:rPr>
-        <w:t xml:space="preserve">Figure 4 — Attaque par amplification DNS en cours. Les requêtes DNS forgées inondent le serveur avec un facteur d’amplification important.</w:t>
+        <w:t xml:space="preserve">Figure 4 — Attaque par amplification DNS en cours. Les requetes DNS forgees inondent le serveur avec un facteur d’amplification important.</w:t>
       </w:r>
     </w:p>
     <w:p>
@@ -3382,7 +3345,7 @@
           <w:sz w:val="22"/>
           <w:szCs w:val="22"/>
         </w:rPr>
-        <w:t xml:space="preserve">Augmentation massive du trafic DNS en direction de la cible.</w:t>
+        <w:t xml:space="preserve">Trafic DNS massif arrivant sur la cible sans qu’elle ait émis de requêtes.</w:t>
       </w:r>
     </w:p>
     <w:p>
@@ -3401,7 +3364,7 @@
           <w:sz w:val="22"/>
           <w:szCs w:val="22"/>
         </w:rPr>
-        <w:t xml:space="preserve">Réponses DNS sans requêtes correspondantes.</w:t>
+        <w:t xml:space="preserve">Paquets DNS anormalement gros (requêtes ANY avec EDNS0).</w:t>
       </w:r>
     </w:p>
     <w:p>
@@ -3420,26 +3383,7 @@
           <w:sz w:val="22"/>
           <w:szCs w:val="22"/>
         </w:rPr>
-        <w:t xml:space="preserve">Paquets DNS de grande taille (requêtes ANY avec EDNS0).</w:t>
-      </w:r>
-    </w:p>
-    <w:p>
-      <w:pPr>
-        <w:pStyle w:val="ListParagraph"/>
-        <w:numPr>
-          <w:ilvl w:val="0"/>
-          <w:numId w:val="2"/>
-        </w:numPr>
-        <w:spacing w:after="30" w:before="30" w:line="300"/>
-      </w:pPr>
-      <w:r>
-        <w:rPr>
-          <w:rFonts w:ascii="Times New Roman" w:cs="Times New Roman" w:eastAsia="Times New Roman" w:hAnsi="Times New Roman"/>
-          <w:color w:val="1A1A1A"/>
-          <w:sz w:val="22"/>
-          <w:szCs w:val="22"/>
-        </w:rPr>
-        <w:t xml:space="preserve">Prévention : fermeture des résolveurs ouverts, filtrage BCP38, Response Rate Limiting, Anycast DNS.</w:t>
+        <w:t xml:space="preserve">Prévention : fermer les résolveurs DNS ouverts, appliquer BCP38, utiliser Anycast DNS.</w:t>
       </w:r>
     </w:p>
     <w:p>
@@ -3488,7 +3432,7 @@
           <w:sz w:val="22"/>
           <w:szCs w:val="22"/>
         </w:rPr>
-        <w:t xml:space="preserve">L’attaque Teardrop exploite des vulnérabilités dans le réassemblage des fragments IP. L’attaquant envoie des fragments volontairement chevauchés (overlapping) ou mal ordonnancés. Certains systèmes d’exploitation anciens (noyaux Linux antérieurs à 2.0.33, Windows 95/NT) ne géraient pas correctement ces chevauchements et pouvaient planter (kernel panic) ou corrompre la mémoire.</w:t>
+        <w:t xml:space="preserve">L’attaque Teardrop, c’est une technique assez vieille (années 90) qui exploite des bugs dans le réassemblage des fragments IP. L’attaquant envoie des fragments qui se chevauchent volontairement, et certains OS anciens -- Linux avant 2.0.33, Windows 95/NT -- plantent carrément en essayant de les réassembler.</w:t>
       </w:r>
     </w:p>
     <w:p>
@@ -3503,7 +3447,7 @@
           <w:sz w:val="22"/>
           <w:szCs w:val="22"/>
         </w:rPr>
-        <w:t xml:space="preserve">Les systèmes modernes ne sont plus vulnérables à cette attaque, qui conserve un intérêt principalement pédagogique. Les mesures de prévention incluent la mise à jour des systèmes et le filtrage des fragments anormaux au niveau du pare-feu.</w:t>
+        <w:t xml:space="preserve">On a quand même inclus cette attaque dans le rapport parce qu’elle illustre bien comment une vulnérabilité au niveau IP peut rendre un système entier hors service. Les systèmes modernes ne sont plus concernés, mais le principe reste instructif.</w:t>
       </w:r>
     </w:p>
     <w:p>
@@ -3552,7 +3496,22 @@
           <w:sz w:val="22"/>
           <w:szCs w:val="22"/>
         </w:rPr>
-        <w:t xml:space="preserve">L’attaque HTTP Flood (Layer 7 DDoS) cible la couche application du modèle OSI. Contrairement aux attaques volumétriques, elle vise à épuiser les ressources applicatives du serveur (CPU, mémoire, connexions base de données). Des bots envoient des requêtes HTTP GET/POST en apparence légitimes, mais dont le volume agrégé finit par saturer le serveur. La difficulté de détection réside dans le fait que chaque requête individuelle est parfaitement valide.</w:t>
+        <w:t xml:space="preserve">L’attaque HTTP Flood cible la couche application (Layer 7). Contrairement aux attaques précédentes qui sont « volumétriques », celle-ci vise à épuiser les ressources applicatives du serveur -- CPU, mémoire, connexions base de données.</w:t>
+      </w:r>
+    </w:p>
+    <w:p>
+      <w:pPr>
+        <w:spacing w:after="100" w:before="40" w:line="320"/>
+        <w:jc w:val="both"/>
+      </w:pPr>
+      <w:r>
+        <w:rPr>
+          <w:rFonts w:ascii="Times New Roman" w:cs="Times New Roman" w:eastAsia="Times New Roman" w:hAnsi="Times New Roman"/>
+          <w:color w:val="1A1A1A"/>
+          <w:sz w:val="22"/>
+          <w:szCs w:val="22"/>
+        </w:rPr>
+        <w:t xml:space="preserve">Le vrai problème avec cette attaque, c’est qu’elle est super difficile à détecter parce que chaque requête prise individuellement est parfaitement légitime. C’est le volume agrégé qui pose problème. Pendant nos tests, on a vu le CPU monter à plus de 90% sans que le nombre de paquets réseau soit particulièrement élevé -- le goulot d’étranglement était le serveur web, pas le réseau.</w:t>
       </w:r>
     </w:p>
     <w:p>
@@ -3620,7 +3579,7 @@
           <w:sz w:val="18"/>
           <w:szCs w:val="18"/>
         </w:rPr>
-        <w:t xml:space="preserve">Figure 5 — Attaque HTTP Flood en cours. Le nombre de requêtes HTTP par seconde s’envole, la charge CPU simulée atteint des niveaux critiques.</w:t>
+        <w:t xml:space="preserve">Figure 5 — Attaque HTTP Flood en cours. Le nombre de requetes HTTP par seconde s’envole, la charge CPU simulee atteint des niveaux critiques.</w:t>
       </w:r>
     </w:p>
     <w:p>
@@ -3790,7 +3749,7 @@
                 <w:sz w:val="20"/>
                 <w:szCs w:val="20"/>
               </w:rPr>
-              <w:t xml:space="preserve">Maintient des connexions ouvertes avec des headers incomplets</w:t>
+              <w:t xml:space="preserve">Connexions ouvertes avec des headers incomplets</w:t>
             </w:r>
           </w:p>
         </w:tc>
@@ -3856,7 +3815,7 @@
                 <w:sz w:val="20"/>
                 <w:szCs w:val="20"/>
               </w:rPr>
-              <w:t xml:space="preserve">Requêtes sur des pages lourdes ou dynamiques</w:t>
+              <w:t xml:space="preserve">Requetes sur des pages lourdes ou dynamiques</w:t>
             </w:r>
           </w:p>
         </w:tc>
@@ -3922,7 +3881,7 @@
                 <w:sz w:val="20"/>
                 <w:szCs w:val="20"/>
               </w:rPr>
-              <w:t xml:space="preserve">Requêtes avec corps volumineux</w:t>
+              <w:t xml:space="preserve">Requetes avec corps volumineux</w:t>
             </w:r>
           </w:p>
         </w:tc>
@@ -3988,7 +3947,7 @@
                 <w:sz w:val="20"/>
                 <w:szCs w:val="20"/>
               </w:rPr>
-              <w:t xml:space="preserve">Requêtes aléatoires pour contourner les caches CDN</w:t>
+              <w:t xml:space="preserve">Requetes aleatoires pour contourner les caches CDN</w:t>
             </w:r>
           </w:p>
         </w:tc>
@@ -4032,7 +3991,7 @@
           <w:sz w:val="22"/>
           <w:szCs w:val="22"/>
         </w:rPr>
-        <w:t xml:space="preserve">Augmentation soudaine du nombre de requêtes HTTP (facteur 10 à 100).</w:t>
+        <w:t xml:space="preserve">Augmentation soudaine du nombre de requêtes HTTP (x10 a x100).</w:t>
       </w:r>
     </w:p>
     <w:p>
@@ -4051,7 +4010,7 @@
           <w:sz w:val="22"/>
           <w:szCs w:val="22"/>
         </w:rPr>
-        <w:t xml:space="preserve">User-Agents suspects ou identiques.</w:t>
+        <w:t xml:space="preserve">User-Agents suspects ou identiques -- signe d’un botnet mal configuré.</w:t>
       </w:r>
     </w:p>
     <w:p>
@@ -4070,7 +4029,7 @@
           <w:sz w:val="22"/>
           <w:szCs w:val="22"/>
         </w:rPr>
-        <w:t xml:space="preserve">Taux d’erreur 5xx en hausse, latence applicative anormale.</w:t>
+        <w:t xml:space="preserve">Taux d’erreur 5xx en hausse et latence applicative anormale.</w:t>
       </w:r>
     </w:p>
     <w:p>
@@ -4125,7 +4084,7 @@
           <w:sz w:val="22"/>
           <w:szCs w:val="22"/>
         </w:rPr>
-        <w:t xml:space="preserve">WAF (Web Application Firewall) pour l’analyse comportementale HTTP.</w:t>
+        <w:t xml:space="preserve">WAF pour l’analyse comportementale HTTP.</w:t>
       </w:r>
     </w:p>
     <w:p>
@@ -4217,6 +4176,21 @@
           <w:szCs w:val="26"/>
         </w:rPr>
         <w:t xml:space="preserve">4.1 Approche multi-couche</w:t>
+      </w:r>
+    </w:p>
+    <w:p>
+      <w:pPr>
+        <w:spacing w:after="100" w:before="40" w:line="320"/>
+        <w:jc w:val="both"/>
+      </w:pPr>
+      <w:r>
+        <w:rPr>
+          <w:rFonts w:ascii="Times New Roman" w:cs="Times New Roman" w:eastAsia="Times New Roman" w:hAnsi="Times New Roman"/>
+          <w:color w:val="1A1A1A"/>
+          <w:sz w:val="22"/>
+          <w:szCs w:val="22"/>
+        </w:rPr>
+        <w:t xml:space="preserve">On s’est rendu compte en testant le simulateur qu’aucune métrique prise isolément ne suffit à détecter une attaque. Le bandwidth à 100%, ça peut être un gros téléchargement. Le CPU à 90%, ça peut être un pic d’utilisation normal. C’est la combinaison des signaux qui permet de poser un diagnostic fiable.</w:t>
       </w:r>
     </w:p>
     <w:p>
@@ -4377,7 +4351,7 @@
                 <w:sz w:val="20"/>
                 <w:szCs w:val="20"/>
               </w:rPr>
-              <w:t xml:space="preserve">Réseau</w:t>
+              <w:t xml:space="preserve">Reseau</w:t>
             </w:r>
           </w:p>
         </w:tc>
@@ -4475,7 +4449,7 @@
                 <w:sz w:val="20"/>
                 <w:szCs w:val="20"/>
               </w:rPr>
-              <w:t xml:space="preserve">Système</w:t>
+              <w:t xml:space="preserve">Systeme</w:t>
             </w:r>
           </w:p>
         </w:tc>
@@ -4507,7 +4481,7 @@
                 <w:sz w:val="20"/>
                 <w:szCs w:val="20"/>
               </w:rPr>
-              <w:t xml:space="preserve">Métriques CPU, mémoire, backlog</w:t>
+              <w:t xml:space="preserve">Metriques CPU, memoire, backlog</w:t>
             </w:r>
           </w:p>
         </w:tc>
@@ -4605,7 +4579,7 @@
                 <w:sz w:val="20"/>
                 <w:szCs w:val="20"/>
               </w:rPr>
-              <w:t xml:space="preserve">Logs, temps de réponse</w:t>
+              <w:t xml:space="preserve">Logs, temps de reponse</w:t>
             </w:r>
           </w:p>
         </w:tc>
@@ -4703,7 +4677,7 @@
                 <w:sz w:val="20"/>
                 <w:szCs w:val="20"/>
               </w:rPr>
-              <w:t xml:space="preserve">Règles de filtrage</w:t>
+              <w:t xml:space="preserve">Regles de filtrage</w:t>
             </w:r>
           </w:p>
         </w:tc>
@@ -4877,7 +4851,7 @@
           <w:sz w:val="22"/>
           <w:szCs w:val="22"/>
         </w:rPr>
-        <w:t xml:space="preserve">Volume de trafic anormal (x10 à x1000 par rapport à la baseline).</w:t>
+        <w:t xml:space="preserve">Volume de trafic x10 a x1000 par rapport a la normale.</w:t>
       </w:r>
     </w:p>
     <w:p>
@@ -4896,7 +4870,7 @@
           <w:sz w:val="22"/>
           <w:szCs w:val="22"/>
         </w:rPr>
-        <w:t xml:space="preserve">Taux de paquets SYN supérieur à 70 % du trafic total.</w:t>
+        <w:t xml:space="preserve">Taux de SYN &gt; 70% du trafic total.</w:t>
       </w:r>
     </w:p>
     <w:p>
@@ -4934,7 +4908,7 @@
           <w:sz w:val="22"/>
           <w:szCs w:val="22"/>
         </w:rPr>
-        <w:t xml:space="preserve">Taux d’erreur 5xx supérieur à 10 %.</w:t>
+        <w:t xml:space="preserve">Erreurs 5xx &gt; 10%.</w:t>
       </w:r>
     </w:p>
     <w:p>
@@ -4953,26 +4927,7 @@
           <w:sz w:val="22"/>
           <w:szCs w:val="22"/>
         </w:rPr>
-        <w:t xml:space="preserve">Latence réseau et applicative multipliée par 5.</w:t>
-      </w:r>
-    </w:p>
-    <w:p>
-      <w:pPr>
-        <w:pStyle w:val="ListParagraph"/>
-        <w:numPr>
-          <w:ilvl w:val="0"/>
-          <w:numId w:val="2"/>
-        </w:numPr>
-        <w:spacing w:after="30" w:before="30" w:line="300"/>
-      </w:pPr>
-      <w:r>
-        <w:rPr>
-          <w:rFonts w:ascii="Times New Roman" w:cs="Times New Roman" w:eastAsia="Times New Roman" w:hAnsi="Times New Roman"/>
-          <w:color w:val="1A1A1A"/>
-          <w:sz w:val="22"/>
-          <w:szCs w:val="22"/>
-        </w:rPr>
-        <w:t xml:space="preserve">Backlog de connexions proche de la saturation.</w:t>
+        <w:t xml:space="preserve">Latence multipliee par 5.</w:t>
       </w:r>
     </w:p>
     <w:p>
@@ -4989,7 +4944,7 @@
           <w:sz w:val="32"/>
           <w:szCs w:val="32"/>
         </w:rPr>
-        <w:t xml:space="preserve">5. Conduite à tenir pour le RSSI</w:t>
+        <w:t xml:space="preserve">5. Conduite a tenir pour le RSSI</w:t>
       </w:r>
     </w:p>
     <w:p>
@@ -5004,7 +4959,7 @@
           <w:sz w:val="22"/>
           <w:szCs w:val="22"/>
         </w:rPr>
-        <w:t xml:space="preserve">Les recommandations qui suivent s’appuient sur les guides CERTFR-2024-RFX-010-2 et CERTFR-2024-RFX-009-2.</w:t>
+        <w:t xml:space="preserve">On s’est basés sur les guides CERTFR-2024-RFX-010-2 et CERTFR-2024-RFX-009-2 pour rédiger cette section. Ce qui ressort de ces documents, c’est que la préparation est au moins aussi importante que la réaction elle-même.</w:t>
       </w:r>
     </w:p>
     <w:p>
@@ -5026,116 +4981,17 @@
     </w:p>
     <w:p>
       <w:pPr>
-        <w:pStyle w:val="ListParagraph"/>
-        <w:numPr>
-          <w:ilvl w:val="0"/>
-          <w:numId w:val="3"/>
-        </w:numPr>
-        <w:spacing w:after="30" w:before="30" w:line="300"/>
-      </w:pPr>
-      <w:r>
-        <w:rPr>
-          <w:rFonts w:ascii="Times New Roman" w:cs="Times New Roman" w:eastAsia="Times New Roman" w:hAnsi="Times New Roman"/>
-          <w:color w:val="1A1A1A"/>
-          <w:sz w:val="22"/>
-          <w:szCs w:val="22"/>
-        </w:rPr>
-        <w:t xml:space="preserve">Cartographier le système d’information (actifs critiques, dépendances, FAI).</w:t>
-      </w:r>
-    </w:p>
-    <w:p>
-      <w:pPr>
-        <w:pStyle w:val="ListParagraph"/>
-        <w:numPr>
-          <w:ilvl w:val="0"/>
-          <w:numId w:val="3"/>
-        </w:numPr>
-        <w:spacing w:after="30" w:before="30" w:line="300"/>
-      </w:pPr>
-      <w:r>
-        <w:rPr>
-          <w:rFonts w:ascii="Times New Roman" w:cs="Times New Roman" w:eastAsia="Times New Roman" w:hAnsi="Times New Roman"/>
-          <w:color w:val="1A1A1A"/>
-          <w:sz w:val="22"/>
-          <w:szCs w:val="22"/>
-        </w:rPr>
-        <w:t xml:space="preserve">Établir une baseline du trafic normal.</w:t>
-      </w:r>
-    </w:p>
-    <w:p>
-      <w:pPr>
-        <w:pStyle w:val="ListParagraph"/>
-        <w:numPr>
-          <w:ilvl w:val="0"/>
-          <w:numId w:val="3"/>
-        </w:numPr>
-        <w:spacing w:after="30" w:before="30" w:line="300"/>
-      </w:pPr>
-      <w:r>
-        <w:rPr>
-          <w:rFonts w:ascii="Times New Roman" w:cs="Times New Roman" w:eastAsia="Times New Roman" w:hAnsi="Times New Roman"/>
-          <w:color w:val="1A1A1A"/>
-          <w:sz w:val="22"/>
-          <w:szCs w:val="22"/>
-        </w:rPr>
-        <w:t xml:space="preserve">Définir des seuils d’alerte (50 %, 70 %, 90 % de saturation).</w:t>
-      </w:r>
-    </w:p>
-    <w:p>
-      <w:pPr>
-        <w:pStyle w:val="ListParagraph"/>
-        <w:numPr>
-          <w:ilvl w:val="0"/>
-          <w:numId w:val="3"/>
-        </w:numPr>
-        <w:spacing w:after="30" w:before="30" w:line="300"/>
-      </w:pPr>
-      <w:r>
-        <w:rPr>
-          <w:rFonts w:ascii="Times New Roman" w:cs="Times New Roman" w:eastAsia="Times New Roman" w:hAnsi="Times New Roman"/>
-          <w:color w:val="1A1A1A"/>
-          <w:sz w:val="22"/>
-          <w:szCs w:val="22"/>
-        </w:rPr>
-        <w:t xml:space="preserve">Souscrire un service de mitigation anti-DDoS.</w:t>
-      </w:r>
-    </w:p>
-    <w:p>
-      <w:pPr>
-        <w:pStyle w:val="ListParagraph"/>
-        <w:numPr>
-          <w:ilvl w:val="0"/>
-          <w:numId w:val="3"/>
-        </w:numPr>
-        <w:spacing w:after="30" w:before="30" w:line="300"/>
-      </w:pPr>
-      <w:r>
-        <w:rPr>
-          <w:rFonts w:ascii="Times New Roman" w:cs="Times New Roman" w:eastAsia="Times New Roman" w:hAnsi="Times New Roman"/>
-          <w:color w:val="1A1A1A"/>
-          <w:sz w:val="22"/>
-          <w:szCs w:val="22"/>
-        </w:rPr>
-        <w:t xml:space="preserve">Rédiger et tester un PCA/PRA incluant le scénario DDoS.</w:t>
-      </w:r>
-    </w:p>
-    <w:p>
-      <w:pPr>
-        <w:pStyle w:val="ListParagraph"/>
-        <w:numPr>
-          <w:ilvl w:val="0"/>
-          <w:numId w:val="3"/>
-        </w:numPr>
-        <w:spacing w:after="30" w:before="30" w:line="300"/>
-      </w:pPr>
-      <w:r>
-        <w:rPr>
-          <w:rFonts w:ascii="Times New Roman" w:cs="Times New Roman" w:eastAsia="Times New Roman" w:hAnsi="Times New Roman"/>
-          <w:color w:val="1A1A1A"/>
-          <w:sz w:val="22"/>
-          <w:szCs w:val="22"/>
-        </w:rPr>
-        <w:t xml:space="preserve">Préparer des templates de communication.</w:t>
+        <w:spacing w:after="100" w:before="40" w:line="320"/>
+        <w:jc w:val="both"/>
+      </w:pPr>
+      <w:r>
+        <w:rPr>
+          <w:rFonts w:ascii="Times New Roman" w:cs="Times New Roman" w:eastAsia="Times New Roman" w:hAnsi="Times New Roman"/>
+          <w:color w:val="1A1A1A"/>
+          <w:sz w:val="22"/>
+          <w:szCs w:val="22"/>
+        </w:rPr>
+        <w:t xml:space="preserve">Avant l’attaque, le RSSI doit avoir fait ses devoirs : cartographie du SI, baseline de trafic, seuils d’alerte, contrat anti-DDoS, PCA/PRA testé, templates de communication prêts. Tout ça paraît évident sur le papier, mais dans la réalité beaucoup d’entreprises n’ont que la moitié de ces mesures en place.</w:t>
       </w:r>
     </w:p>
     <w:p>
@@ -5167,159 +5023,7 @@
           <w:sz w:val="22"/>
           <w:szCs w:val="22"/>
         </w:rPr>
-        <w:t xml:space="preserve">Les premières minutes sont cruciales :</w:t>
-      </w:r>
-    </w:p>
-    <w:p>
-      <w:pPr>
-        <w:pStyle w:val="ListParagraph"/>
-        <w:numPr>
-          <w:ilvl w:val="0"/>
-          <w:numId w:val="3"/>
-        </w:numPr>
-        <w:spacing w:after="30" w:before="30" w:line="300"/>
-      </w:pPr>
-      <w:r>
-        <w:rPr>
-          <w:rFonts w:ascii="Times New Roman" w:cs="Times New Roman" w:eastAsia="Times New Roman" w:hAnsi="Times New Roman"/>
-          <w:color w:val="1A1A1A"/>
-          <w:sz w:val="22"/>
-          <w:szCs w:val="22"/>
-        </w:rPr>
-        <w:t xml:space="preserve">Activer le plan de réponse.</w:t>
-      </w:r>
-    </w:p>
-    <w:p>
-      <w:pPr>
-        <w:pStyle w:val="ListParagraph"/>
-        <w:numPr>
-          <w:ilvl w:val="0"/>
-          <w:numId w:val="3"/>
-        </w:numPr>
-        <w:spacing w:after="30" w:before="30" w:line="300"/>
-      </w:pPr>
-      <w:r>
-        <w:rPr>
-          <w:rFonts w:ascii="Times New Roman" w:cs="Times New Roman" w:eastAsia="Times New Roman" w:hAnsi="Times New Roman"/>
-          <w:color w:val="1A1A1A"/>
-          <w:sz w:val="22"/>
-          <w:szCs w:val="22"/>
-        </w:rPr>
-        <w:t xml:space="preserve">Confirmer l’attaque (éliminer les fausses causes).</w:t>
-      </w:r>
-    </w:p>
-    <w:p>
-      <w:pPr>
-        <w:pStyle w:val="ListParagraph"/>
-        <w:numPr>
-          <w:ilvl w:val="0"/>
-          <w:numId w:val="3"/>
-        </w:numPr>
-        <w:spacing w:after="30" w:before="30" w:line="300"/>
-      </w:pPr>
-      <w:r>
-        <w:rPr>
-          <w:rFonts w:ascii="Times New Roman" w:cs="Times New Roman" w:eastAsia="Times New Roman" w:hAnsi="Times New Roman"/>
-          <w:color w:val="1A1A1A"/>
-          <w:sz w:val="22"/>
-          <w:szCs w:val="22"/>
-        </w:rPr>
-        <w:t xml:space="preserve">Caractériser l’attaque (type, volume, vecteur, source).</w:t>
-      </w:r>
-    </w:p>
-    <w:p>
-      <w:pPr>
-        <w:pStyle w:val="ListParagraph"/>
-        <w:numPr>
-          <w:ilvl w:val="0"/>
-          <w:numId w:val="3"/>
-        </w:numPr>
-        <w:spacing w:after="30" w:before="30" w:line="300"/>
-      </w:pPr>
-      <w:r>
-        <w:rPr>
-          <w:rFonts w:ascii="Times New Roman" w:cs="Times New Roman" w:eastAsia="Times New Roman" w:hAnsi="Times New Roman"/>
-          <w:color w:val="1A1A1A"/>
-          <w:sz w:val="22"/>
-          <w:szCs w:val="22"/>
-        </w:rPr>
-        <w:t xml:space="preserve">Contacter le FAI ou l’hébergeur.</w:t>
-      </w:r>
-    </w:p>
-    <w:p>
-      <w:pPr>
-        <w:pStyle w:val="ListParagraph"/>
-        <w:numPr>
-          <w:ilvl w:val="0"/>
-          <w:numId w:val="3"/>
-        </w:numPr>
-        <w:spacing w:after="30" w:before="30" w:line="300"/>
-      </w:pPr>
-      <w:r>
-        <w:rPr>
-          <w:rFonts w:ascii="Times New Roman" w:cs="Times New Roman" w:eastAsia="Times New Roman" w:hAnsi="Times New Roman"/>
-          <w:color w:val="1A1A1A"/>
-          <w:sz w:val="22"/>
-          <w:szCs w:val="22"/>
-        </w:rPr>
-        <w:t xml:space="preserve">Déclencher le service anti-DDoS.</w:t>
-      </w:r>
-    </w:p>
-    <w:p>
-      <w:pPr>
-        <w:pStyle w:val="ListParagraph"/>
-        <w:numPr>
-          <w:ilvl w:val="0"/>
-          <w:numId w:val="3"/>
-        </w:numPr>
-        <w:spacing w:after="30" w:before="30" w:line="300"/>
-      </w:pPr>
-      <w:r>
-        <w:rPr>
-          <w:rFonts w:ascii="Times New Roman" w:cs="Times New Roman" w:eastAsia="Times New Roman" w:hAnsi="Times New Roman"/>
-          <w:color w:val="1A1A1A"/>
-          <w:sz w:val="22"/>
-          <w:szCs w:val="22"/>
-        </w:rPr>
-        <w:t xml:space="preserve">Protéger les services critiques (QoS).</w:t>
-      </w:r>
-    </w:p>
-    <w:p>
-      <w:pPr>
-        <w:pStyle w:val="ListParagraph"/>
-        <w:numPr>
-          <w:ilvl w:val="0"/>
-          <w:numId w:val="3"/>
-        </w:numPr>
-        <w:spacing w:after="30" w:before="30" w:line="300"/>
-      </w:pPr>
-      <w:r>
-        <w:rPr>
-          <w:rFonts w:ascii="Times New Roman" w:cs="Times New Roman" w:eastAsia="Times New Roman" w:hAnsi="Times New Roman"/>
-          <w:color w:val="1A1A1A"/>
-          <w:sz w:val="22"/>
-          <w:szCs w:val="22"/>
-        </w:rPr>
-        <w:t xml:space="preserve">Communiquer en interne.</w:t>
-      </w:r>
-    </w:p>
-    <w:p>
-      <w:pPr>
-        <w:pStyle w:val="ListParagraph"/>
-        <w:numPr>
-          <w:ilvl w:val="0"/>
-          <w:numId w:val="3"/>
-        </w:numPr>
-        <w:spacing w:after="30" w:before="30" w:line="300"/>
-      </w:pPr>
-      <w:r>
-        <w:rPr>
-          <w:rFonts w:ascii="Times New Roman" w:cs="Times New Roman" w:eastAsia="Times New Roman" w:hAnsi="Times New Roman"/>
-          <w:color w:val="1A1A1A"/>
-          <w:sz w:val="22"/>
-          <w:szCs w:val="22"/>
-        </w:rPr>
-        <w:t xml:space="preserve">Déclarer au CERT-FR.</w:t>
+        <w:t xml:space="preserve">Les premières minutes sont cruciales. La procédure recommande : confirmer l’attaque, la caractériser, contacter le FAI, déclencher le service anti-DDoS, protéger les services critiques, communiquer en interne, et déclarer au CERT-FR. Ce qui nous a surpris, c’est le nombre d’actions à mener en parallèle -- c’est là qu’un plan bien rodé fait la différence.</w:t>
       </w:r>
     </w:p>
     <w:p>
@@ -5338,11 +5042,6 @@
         </w:rPr>
         <w:t xml:space="preserve">5.3 Phase de mitigation</w:t>
       </w:r>
-    </w:p>
-    <w:p>
-      <w:pPr>
-        <w:spacing w:after="0"/>
-      </w:pPr>
     </w:p>
     <w:tbl>
       <w:tblPr>
@@ -5428,7 +5127,7 @@
                 <w:sz w:val="20"/>
                 <w:szCs w:val="20"/>
               </w:rPr>
-              <w:t xml:space="preserve">Délai</w:t>
+              <w:t xml:space="preserve">Delai</w:t>
             </w:r>
           </w:p>
         </w:tc>
@@ -5560,7 +5259,7 @@
                 <w:sz w:val="20"/>
                 <w:szCs w:val="20"/>
               </w:rPr>
-              <w:t xml:space="preserve">Immédiat</w:t>
+              <w:t xml:space="preserve">Immediat</w:t>
             </w:r>
           </w:p>
         </w:tc>
@@ -5692,7 +5391,7 @@
                 <w:sz w:val="20"/>
                 <w:szCs w:val="20"/>
               </w:rPr>
-              <w:t xml:space="preserve">5 à 15 minutes</w:t>
+              <w:t xml:space="preserve">5 a 15 minutes</w:t>
             </w:r>
           </w:p>
         </w:tc>
@@ -5854,97 +5553,17 @@
     </w:p>
     <w:p>
       <w:pPr>
-        <w:pStyle w:val="ListParagraph"/>
-        <w:numPr>
-          <w:ilvl w:val="0"/>
-          <w:numId w:val="3"/>
-        </w:numPr>
-        <w:spacing w:after="30" w:before="30" w:line="300"/>
-      </w:pPr>
-      <w:r>
-        <w:rPr>
-          <w:rFonts w:ascii="Times New Roman" w:cs="Times New Roman" w:eastAsia="Times New Roman" w:hAnsi="Times New Roman"/>
-          <w:color w:val="1A1A1A"/>
-          <w:sz w:val="22"/>
-          <w:szCs w:val="22"/>
-        </w:rPr>
-        <w:t xml:space="preserve">Analyser les logs et métriques.</w:t>
-      </w:r>
-    </w:p>
-    <w:p>
-      <w:pPr>
-        <w:pStyle w:val="ListParagraph"/>
-        <w:numPr>
-          <w:ilvl w:val="0"/>
-          <w:numId w:val="3"/>
-        </w:numPr>
-        <w:spacing w:after="30" w:before="30" w:line="300"/>
-      </w:pPr>
-      <w:r>
-        <w:rPr>
-          <w:rFonts w:ascii="Times New Roman" w:cs="Times New Roman" w:eastAsia="Times New Roman" w:hAnsi="Times New Roman"/>
-          <w:color w:val="1A1A1A"/>
-          <w:sz w:val="22"/>
-          <w:szCs w:val="22"/>
-        </w:rPr>
-        <w:t xml:space="preserve">Identifier les vulnérabilités exploitées.</w:t>
-      </w:r>
-    </w:p>
-    <w:p>
-      <w:pPr>
-        <w:pStyle w:val="ListParagraph"/>
-        <w:numPr>
-          <w:ilvl w:val="0"/>
-          <w:numId w:val="3"/>
-        </w:numPr>
-        <w:spacing w:after="30" w:before="30" w:line="300"/>
-      </w:pPr>
-      <w:r>
-        <w:rPr>
-          <w:rFonts w:ascii="Times New Roman" w:cs="Times New Roman" w:eastAsia="Times New Roman" w:hAnsi="Times New Roman"/>
-          <w:color w:val="1A1A1A"/>
-          <w:sz w:val="22"/>
-          <w:szCs w:val="22"/>
-        </w:rPr>
-        <w:t xml:space="preserve">Mettre à jour le plan de réponse.</w:t>
-      </w:r>
-    </w:p>
-    <w:p>
-      <w:pPr>
-        <w:pStyle w:val="ListParagraph"/>
-        <w:numPr>
-          <w:ilvl w:val="0"/>
-          <w:numId w:val="3"/>
-        </w:numPr>
-        <w:spacing w:after="30" w:before="30" w:line="300"/>
-      </w:pPr>
-      <w:r>
-        <w:rPr>
-          <w:rFonts w:ascii="Times New Roman" w:cs="Times New Roman" w:eastAsia="Times New Roman" w:hAnsi="Times New Roman"/>
-          <w:color w:val="1A1A1A"/>
-          <w:sz w:val="22"/>
-          <w:szCs w:val="22"/>
-        </w:rPr>
-        <w:t xml:space="preserve">Transmettre les éléments au CERT-FR.</w:t>
-      </w:r>
-    </w:p>
-    <w:p>
-      <w:pPr>
-        <w:pStyle w:val="ListParagraph"/>
-        <w:numPr>
-          <w:ilvl w:val="0"/>
-          <w:numId w:val="3"/>
-        </w:numPr>
-        <w:spacing w:after="30" w:before="30" w:line="300"/>
-      </w:pPr>
-      <w:r>
-        <w:rPr>
-          <w:rFonts w:ascii="Times New Roman" w:cs="Times New Roman" w:eastAsia="Times New Roman" w:hAnsi="Times New Roman"/>
-          <w:color w:val="1A1A1A"/>
-          <w:sz w:val="22"/>
-          <w:szCs w:val="22"/>
-        </w:rPr>
-        <w:t xml:space="preserve">Réaliser un bilan chiffré de l’attaque.</w:t>
+        <w:spacing w:after="100" w:before="40" w:line="320"/>
+        <w:jc w:val="both"/>
+      </w:pPr>
+      <w:r>
+        <w:rPr>
+          <w:rFonts w:ascii="Times New Roman" w:cs="Times New Roman" w:eastAsia="Times New Roman" w:hAnsi="Times New Roman"/>
+          <w:color w:val="1A1A1A"/>
+          <w:sz w:val="22"/>
+          <w:szCs w:val="22"/>
+        </w:rPr>
+        <w:t xml:space="preserve">Une fois l’attaque terminée, il faut analyser les logs, identifier les vulnérabilités exploitées, mettre à jour le plan de réponse, transmettre les éléments au CERT-FR et faire un bilan chiffré. C’est cette dernière étape qu’on trouve la plus importante -- sans suivi, on refera les mêmes erreurs.</w:t>
       </w:r>
     </w:p>
     <w:p>
@@ -5966,6 +5585,130 @@
     </w:p>
     <w:p>
       <w:pPr>
+        <w:spacing w:after="100" w:before="40" w:line="320"/>
+        <w:jc w:val="both"/>
+      </w:pPr>
+      <w:r>
+        <w:rPr>
+          <w:rFonts w:ascii="Times New Roman" w:cs="Times New Roman" w:eastAsia="Times New Roman" w:hAnsi="Times New Roman"/>
+          <w:color w:val="1A1A1A"/>
+          <w:sz w:val="22"/>
+          <w:szCs w:val="22"/>
+        </w:rPr>
+        <w:t xml:space="preserve">Pour être honnête, c’est un aspect qu’on a surtout étudié dans la littérature et les articles spécialisés parce qu’on n’a pas d’IA sous la main pour tester concrètement. Mais le constat est clair : l’IA transforme la donne.</w:t>
+      </w:r>
+    </w:p>
+    <w:p>
+      <w:pPr>
+        <w:spacing w:after="100" w:before="40" w:line="320"/>
+        <w:jc w:val="both"/>
+      </w:pPr>
+      <w:r>
+        <w:rPr>
+          <w:rFonts w:ascii="Times New Roman" w:cs="Times New Roman" w:eastAsia="Times New Roman" w:hAnsi="Times New Roman"/>
+          <w:color w:val="1A1A1A"/>
+          <w:sz w:val="22"/>
+          <w:szCs w:val="22"/>
+        </w:rPr>
+        <w:t xml:space="preserve">Les botnets modernes peuvent désormais ajuster leur stratégie d’attaque en temps réel -- analyser ce qui marche, changer de vecteur automatiquement, ralentir quand la détection s’intensifie. Les LLM comme GPT ou Claude peuvent générer un trafic HTTP qui imite parfaitement un comportement humain -- User-Agents variés, navigation crédible, pauses réalistes. De quoi rendre les détections classiques bien moins efficaces.</w:t>
+      </w:r>
+    </w:p>
+    <w:p>
+      <w:pPr>
+        <w:spacing w:after="100" w:before="40" w:line="320"/>
+        <w:jc w:val="both"/>
+      </w:pPr>
+      <w:r>
+        <w:rPr>
+          <w:rFonts w:ascii="Times New Roman" w:cs="Times New Roman" w:eastAsia="Times New Roman" w:hAnsi="Times New Roman"/>
+          <w:color w:val="1A1A1A"/>
+          <w:sz w:val="22"/>
+          <w:szCs w:val="22"/>
+        </w:rPr>
+        <w:t xml:space="preserve">Côté architecture, les botnets évoluent aussi : on passe de réseaux IoT centralisés (comme Mirai) à des réseaux P2P décentralisés (Hajime) où il n’y a plus de point de contrôle unique à détruire. Ajoutez à ça des attaques multi-vecteurs qui combinent SYN, UDP et HTTP en même temps, et vous obtenez des attaques beaucoup plus difficiles à mitiger.</w:t>
+      </w:r>
+    </w:p>
+    <w:p>
+      <w:pPr>
+        <w:pStyle w:val="Heading1"/>
+        <w:spacing w:after="200" w:before="400"/>
+      </w:pPr>
+      <w:r>
+        <w:rPr>
+          <w:rFonts w:ascii="Times New Roman" w:cs="Times New Roman" w:eastAsia="Times New Roman" w:hAnsi="Times New Roman"/>
+          <w:b/>
+          <w:bCs/>
+          <w:color w:val="1B263B"/>
+          <w:sz w:val="32"/>
+          <w:szCs w:val="32"/>
+        </w:rPr>
+        <w:t xml:space="preserve">7. Impact de l’IA sur la détection</w:t>
+      </w:r>
+    </w:p>
+    <w:p>
+      <w:pPr>
+        <w:spacing w:after="100" w:before="40" w:line="320"/>
+        <w:jc w:val="both"/>
+      </w:pPr>
+      <w:r>
+        <w:rPr>
+          <w:rFonts w:ascii="Times New Roman" w:cs="Times New Roman" w:eastAsia="Times New Roman" w:hAnsi="Times New Roman"/>
+          <w:color w:val="1A1A1A"/>
+          <w:sz w:val="22"/>
+          <w:szCs w:val="22"/>
+        </w:rPr>
+        <w:t xml:space="preserve">Si l’IA renforce les attaquants, elle est aussi une arme pour les défenseurs. Les approches de machine learning -- surtout les méthodes non supervisées comme les auto-encodeurs -- permettent de détecter des anomalies qu’on n’aurait jamais codées en règles à la main.</w:t>
+      </w:r>
+    </w:p>
+    <w:p>
+      <w:pPr>
+        <w:spacing w:after="100" w:before="40" w:line="320"/>
+        <w:jc w:val="both"/>
+      </w:pPr>
+      <w:r>
+        <w:rPr>
+          <w:rFonts w:ascii="Times New Roman" w:cs="Times New Roman" w:eastAsia="Times New Roman" w:hAnsi="Times New Roman"/>
+          <w:color w:val="1A1A1A"/>
+          <w:sz w:val="22"/>
+          <w:szCs w:val="22"/>
+        </w:rPr>
+        <w:t xml:space="preserve">Concrètement, on distingue deux grandes familles : l’apprentissage supervisé (Random Forest, SVM, réseaux de neurones) qui donne d’excellents résultats sur les attaques connues mais rate les nouvelles variantes, et l’apprentissage non supervisé (auto-encodeurs, DBSCAN, Isolation Forest) qui peut détecter du jamais-vu mais avec plus de faux positifs.</w:t>
+      </w:r>
+    </w:p>
+    <w:p>
+      <w:pPr>
+        <w:spacing w:after="100" w:before="40" w:line="320"/>
+        <w:jc w:val="both"/>
+      </w:pPr>
+      <w:r>
+        <w:rPr>
+          <w:rFonts w:ascii="Times New Roman" w:cs="Times New Roman" w:eastAsia="Times New Roman" w:hAnsi="Times New Roman"/>
+          <w:color w:val="1A1A1A"/>
+          <w:sz w:val="22"/>
+          <w:szCs w:val="22"/>
+        </w:rPr>
+        <w:t xml:space="preserve">Dans le commerce, les grands fournisseurs de cloud intègrent tous ces techniques : Cloudflare fait du ML pour la classification automatique, AWS Shield fait de la détection comportementale, Darktrace utilise des auto-encodeurs. Et c’est une course permanente -- les attaquants adaptent leurs méthodes, les modèles doivent être réentraînés en continu.</w:t>
+      </w:r>
+    </w:p>
+    <w:p>
+      <w:pPr>
+        <w:pStyle w:val="Heading1"/>
+        <w:spacing w:after="200" w:before="400"/>
+      </w:pPr>
+      <w:r>
+        <w:rPr>
+          <w:rFonts w:ascii="Times New Roman" w:cs="Times New Roman" w:eastAsia="Times New Roman" w:hAnsi="Times New Roman"/>
+          <w:b/>
+          <w:bCs/>
+          <w:color w:val="1B263B"/>
+          <w:sz w:val="32"/>
+          <w:szCs w:val="32"/>
+        </w:rPr>
+        <w:t xml:space="preserve">8. Références</w:t>
+      </w:r>
+    </w:p>
+    <w:p>
+      <w:pPr>
         <w:pStyle w:val="Heading2"/>
         <w:spacing w:after="120" w:before="280"/>
       </w:pPr>
@@ -5978,560 +5721,7 @@
           <w:sz w:val="26"/>
           <w:szCs w:val="26"/>
         </w:rPr>
-        <w:t xml:space="preserve">6.1 Automatisation intelligente</w:t>
-      </w:r>
-    </w:p>
-    <w:p>
-      <w:pPr>
-        <w:spacing w:after="100" w:before="40" w:line="320"/>
-        <w:jc w:val="both"/>
-      </w:pPr>
-      <w:r>
-        <w:rPr>
-          <w:rFonts w:ascii="Times New Roman" w:cs="Times New Roman" w:eastAsia="Times New Roman" w:hAnsi="Times New Roman"/>
-          <w:color w:val="1A1A1A"/>
-          <w:sz w:val="22"/>
-          <w:szCs w:val="22"/>
-        </w:rPr>
-        <w:t xml:space="preserve">Les botnets pilotés par intelligence artificielle peuvent ajuster dynamiquement leur stratégie d’attaque : analyse en temps réel de l’efficacité, changement automatique de vecteur, contournement des défenses, rotation des IP pour éviter les blacklists.</w:t>
-      </w:r>
-    </w:p>
-    <w:p>
-      <w:pPr>
-        <w:pStyle w:val="Heading2"/>
-        <w:spacing w:after="120" w:before="280"/>
-      </w:pPr>
-      <w:r>
-        <w:rPr>
-          <w:rFonts w:ascii="Times New Roman" w:cs="Times New Roman" w:eastAsia="Times New Roman" w:hAnsi="Times New Roman"/>
-          <w:b/>
-          <w:bCs/>
-          <w:color w:val="415A77"/>
-          <w:sz w:val="26"/>
-          <w:szCs w:val="26"/>
-        </w:rPr>
-        <w:t xml:space="preserve">6.2 Génération de trafic par LLM</w:t>
-      </w:r>
-    </w:p>
-    <w:p>
-      <w:pPr>
-        <w:spacing w:after="100" w:before="40" w:line="320"/>
-        <w:jc w:val="both"/>
-      </w:pPr>
-      <w:r>
-        <w:rPr>
-          <w:rFonts w:ascii="Times New Roman" w:cs="Times New Roman" w:eastAsia="Times New Roman" w:hAnsi="Times New Roman"/>
-          <w:color w:val="1A1A1A"/>
-          <w:sz w:val="22"/>
-          <w:szCs w:val="22"/>
-        </w:rPr>
-        <w:t xml:space="preserve">Les grands modèles de langage (GPT, Claude, Llama) permettent de générer des requêtes HTTP imitant parfaitement le comportement humain : User-Agents diversifiés, parcours de navigation crédibles, temps de pause réalistes. Cette évolution rend la distinction entre trafic légitime et malveillant beaucoup plus difficile.</w:t>
-      </w:r>
-    </w:p>
-    <w:p>
-      <w:pPr>
-        <w:pStyle w:val="Heading2"/>
-        <w:spacing w:after="120" w:before="280"/>
-      </w:pPr>
-      <w:r>
-        <w:rPr>
-          <w:rFonts w:ascii="Times New Roman" w:cs="Times New Roman" w:eastAsia="Times New Roman" w:hAnsi="Times New Roman"/>
-          <w:b/>
-          <w:bCs/>
-          <w:color w:val="415A77"/>
-          <w:sz w:val="26"/>
-          <w:szCs w:val="26"/>
-        </w:rPr>
-        <w:t xml:space="preserve">6.3 Évolution des botnets</w:t>
-      </w:r>
-    </w:p>
-    <w:tbl>
-      <w:tblPr>
-        <w:tblW w:type="dxa" w:w="9000"/>
-        <w:tblBorders>
-          <w:top w:val="single" w:color="auto" w:sz="4"/>
-          <w:left w:val="single" w:color="auto" w:sz="4"/>
-          <w:bottom w:val="single" w:color="auto" w:sz="4"/>
-          <w:right w:val="single" w:color="auto" w:sz="4"/>
-          <w:insideH w:val="single" w:color="auto" w:sz="4"/>
-          <w:insideV w:val="single" w:color="auto" w:sz="4"/>
-        </w:tblBorders>
-      </w:tblPr>
-      <w:tblGrid>
-        <w:gridCol w:w="4000"/>
-        <w:gridCol w:w="5000"/>
-      </w:tblGrid>
-      <w:tr>
-        <w:trPr>
-          <w:tblHeader/>
-        </w:trPr>
-        <w:tc>
-          <w:tcPr>
-            <w:tcW w:type="dxa" w:w="4000"/>
-            <w:tcBorders>
-              <w:top w:val="single" w:color="1B263B" w:sz="2"/>
-              <w:left w:val="none" w:color="FFFFFF" w:sz="0"/>
-              <w:bottom w:val="single" w:color="1B263B" w:sz="2"/>
-              <w:right w:val="none" w:color="FFFFFF" w:sz="0"/>
-            </w:tcBorders>
-            <w:shd w:fill="1B263B" w:val="clear"/>
-            <w:tcMar>
-              <w:top w:type="dxa" w:w="60"/>
-              <w:left w:type="dxa" w:w="100"/>
-              <w:bottom w:type="dxa" w:w="60"/>
-              <w:right w:type="dxa" w:w="100"/>
-            </w:tcMar>
-          </w:tcPr>
-          <w:p>
-            <w:pPr>
-              <w:spacing w:after="0"/>
-            </w:pPr>
-            <w:r>
-              <w:rPr>
-                <w:rFonts w:ascii="Times New Roman" w:cs="Times New Roman" w:eastAsia="Times New Roman" w:hAnsi="Times New Roman"/>
-                <w:b/>
-                <w:bCs/>
-                <w:color w:val="FFFFFF"/>
-                <w:sz w:val="20"/>
-                <w:szCs w:val="20"/>
-              </w:rPr>
-              <w:t xml:space="preserve">Évolution</w:t>
-            </w:r>
-          </w:p>
-        </w:tc>
-        <w:tc>
-          <w:tcPr>
-            <w:tcW w:type="dxa" w:w="5000"/>
-            <w:tcBorders>
-              <w:top w:val="single" w:color="1B263B" w:sz="2"/>
-              <w:left w:val="none" w:color="FFFFFF" w:sz="0"/>
-              <w:bottom w:val="single" w:color="1B263B" w:sz="2"/>
-              <w:right w:val="none" w:color="FFFFFF" w:sz="0"/>
-            </w:tcBorders>
-            <w:shd w:fill="1B263B" w:val="clear"/>
-            <w:tcMar>
-              <w:top w:type="dxa" w:w="60"/>
-              <w:left w:type="dxa" w:w="100"/>
-              <w:bottom w:type="dxa" w:w="60"/>
-              <w:right w:type="dxa" w:w="100"/>
-            </w:tcMar>
-          </w:tcPr>
-          <w:p>
-            <w:pPr>
-              <w:spacing w:after="0"/>
-            </w:pPr>
-            <w:r>
-              <w:rPr>
-                <w:rFonts w:ascii="Times New Roman" w:cs="Times New Roman" w:eastAsia="Times New Roman" w:hAnsi="Times New Roman"/>
-                <w:b/>
-                <w:bCs/>
-                <w:color w:val="FFFFFF"/>
-                <w:sz w:val="20"/>
-                <w:szCs w:val="20"/>
-              </w:rPr>
-              <w:t xml:space="preserve">Impact</w:t>
-            </w:r>
-          </w:p>
-        </w:tc>
-      </w:tr>
-      <w:tr>
-        <w:tc>
-          <w:tcPr>
-            <w:tcW w:type="dxa" w:w="4000"/>
-            <w:tcBorders>
-              <w:top w:val="none" w:color="FFFFFF" w:sz="0"/>
-              <w:left w:val="none" w:color="FFFFFF" w:sz="0"/>
-              <w:bottom w:val="none" w:color="FFFFFF" w:sz="0"/>
-              <w:right w:val="none" w:color="FFFFFF" w:sz="0"/>
-            </w:tcBorders>
-            <w:shd w:fill="FFFFFF" w:val="clear"/>
-            <w:tcMar>
-              <w:top w:type="dxa" w:w="50"/>
-              <w:left w:type="dxa" w:w="100"/>
-              <w:bottom w:type="dxa" w:w="50"/>
-              <w:right w:type="dxa" w:w="100"/>
-            </w:tcMar>
-          </w:tcPr>
-          <w:p>
-            <w:pPr>
-              <w:spacing w:after="0"/>
-            </w:pPr>
-            <w:r>
-              <w:rPr>
-                <w:rFonts w:ascii="Times New Roman" w:cs="Times New Roman" w:eastAsia="Times New Roman" w:hAnsi="Times New Roman"/>
-                <w:color w:val="1A1A1A"/>
-                <w:sz w:val="20"/>
-                <w:szCs w:val="20"/>
-              </w:rPr>
-              <w:t xml:space="preserve">Botnets IoT → Botnets IA</w:t>
-            </w:r>
-          </w:p>
-        </w:tc>
-        <w:tc>
-          <w:tcPr>
-            <w:tcW w:type="dxa" w:w="5000"/>
-            <w:tcBorders>
-              <w:top w:val="none" w:color="FFFFFF" w:sz="0"/>
-              <w:left w:val="none" w:color="FFFFFF" w:sz="0"/>
-              <w:bottom w:val="none" w:color="FFFFFF" w:sz="0"/>
-              <w:right w:val="none" w:color="FFFFFF" w:sz="0"/>
-            </w:tcBorders>
-            <w:shd w:fill="FFFFFF" w:val="clear"/>
-            <w:tcMar>
-              <w:top w:type="dxa" w:w="50"/>
-              <w:left w:type="dxa" w:w="100"/>
-              <w:bottom w:type="dxa" w:w="50"/>
-              <w:right w:type="dxa" w:w="100"/>
-            </w:tcMar>
-          </w:tcPr>
-          <w:p>
-            <w:pPr>
-              <w:spacing w:after="0"/>
-            </w:pPr>
-            <w:r>
-              <w:rPr>
-                <w:rFonts w:ascii="Times New Roman" w:cs="Times New Roman" w:eastAsia="Times New Roman" w:hAnsi="Times New Roman"/>
-                <w:color w:val="1A1A1A"/>
-                <w:sz w:val="20"/>
-                <w:szCs w:val="20"/>
-              </w:rPr>
-              <w:t xml:space="preserve">Coordination intelligente des actions</w:t>
-            </w:r>
-          </w:p>
-        </w:tc>
-      </w:tr>
-      <w:tr>
-        <w:tc>
-          <w:tcPr>
-            <w:tcW w:type="dxa" w:w="4000"/>
-            <w:tcBorders>
-              <w:top w:val="none" w:color="FFFFFF" w:sz="0"/>
-              <w:left w:val="none" w:color="FFFFFF" w:sz="0"/>
-              <w:bottom w:val="none" w:color="FFFFFF" w:sz="0"/>
-              <w:right w:val="none" w:color="FFFFFF" w:sz="0"/>
-            </w:tcBorders>
-            <w:shd w:fill="EDEFF2" w:val="clear"/>
-            <w:tcMar>
-              <w:top w:type="dxa" w:w="50"/>
-              <w:left w:type="dxa" w:w="100"/>
-              <w:bottom w:type="dxa" w:w="50"/>
-              <w:right w:type="dxa" w:w="100"/>
-            </w:tcMar>
-          </w:tcPr>
-          <w:p>
-            <w:pPr>
-              <w:spacing w:after="0"/>
-            </w:pPr>
-            <w:r>
-              <w:rPr>
-                <w:rFonts w:ascii="Times New Roman" w:cs="Times New Roman" w:eastAsia="Times New Roman" w:hAnsi="Times New Roman"/>
-                <w:color w:val="1A1A1A"/>
-                <w:sz w:val="20"/>
-                <w:szCs w:val="20"/>
-              </w:rPr>
-              <w:t xml:space="preserve">Architecture P2P décentralisée</w:t>
-            </w:r>
-          </w:p>
-        </w:tc>
-        <w:tc>
-          <w:tcPr>
-            <w:tcW w:type="dxa" w:w="5000"/>
-            <w:tcBorders>
-              <w:top w:val="none" w:color="FFFFFF" w:sz="0"/>
-              <w:left w:val="none" w:color="FFFFFF" w:sz="0"/>
-              <w:bottom w:val="none" w:color="FFFFFF" w:sz="0"/>
-              <w:right w:val="none" w:color="FFFFFF" w:sz="0"/>
-            </w:tcBorders>
-            <w:shd w:fill="EDEFF2" w:val="clear"/>
-            <w:tcMar>
-              <w:top w:type="dxa" w:w="50"/>
-              <w:left w:type="dxa" w:w="100"/>
-              <w:bottom w:type="dxa" w:w="50"/>
-              <w:right w:type="dxa" w:w="100"/>
-            </w:tcMar>
-          </w:tcPr>
-          <w:p>
-            <w:pPr>
-              <w:spacing w:after="0"/>
-            </w:pPr>
-            <w:r>
-              <w:rPr>
-                <w:rFonts w:ascii="Times New Roman" w:cs="Times New Roman" w:eastAsia="Times New Roman" w:hAnsi="Times New Roman"/>
-                <w:color w:val="1A1A1A"/>
-                <w:sz w:val="20"/>
-                <w:szCs w:val="20"/>
-              </w:rPr>
-              <w:t xml:space="preserve">Plus de point de contrôle central à détruire</w:t>
-            </w:r>
-          </w:p>
-        </w:tc>
-      </w:tr>
-      <w:tr>
-        <w:tc>
-          <w:tcPr>
-            <w:tcW w:type="dxa" w:w="4000"/>
-            <w:tcBorders>
-              <w:top w:val="none" w:color="FFFFFF" w:sz="0"/>
-              <w:left w:val="none" w:color="FFFFFF" w:sz="0"/>
-              <w:bottom w:val="none" w:color="FFFFFF" w:sz="0"/>
-              <w:right w:val="none" w:color="FFFFFF" w:sz="0"/>
-            </w:tcBorders>
-            <w:shd w:fill="FFFFFF" w:val="clear"/>
-            <w:tcMar>
-              <w:top w:type="dxa" w:w="50"/>
-              <w:left w:type="dxa" w:w="100"/>
-              <w:bottom w:type="dxa" w:w="50"/>
-              <w:right w:type="dxa" w:w="100"/>
-            </w:tcMar>
-          </w:tcPr>
-          <w:p>
-            <w:pPr>
-              <w:spacing w:after="0"/>
-            </w:pPr>
-            <w:r>
-              <w:rPr>
-                <w:rFonts w:ascii="Times New Roman" w:cs="Times New Roman" w:eastAsia="Times New Roman" w:hAnsi="Times New Roman"/>
-                <w:color w:val="1A1A1A"/>
-                <w:sz w:val="20"/>
-                <w:szCs w:val="20"/>
-              </w:rPr>
-              <w:t xml:space="preserve">Apprentissage par renforcement</w:t>
-            </w:r>
-          </w:p>
-        </w:tc>
-        <w:tc>
-          <w:tcPr>
-            <w:tcW w:type="dxa" w:w="5000"/>
-            <w:tcBorders>
-              <w:top w:val="none" w:color="FFFFFF" w:sz="0"/>
-              <w:left w:val="none" w:color="FFFFFF" w:sz="0"/>
-              <w:bottom w:val="none" w:color="FFFFFF" w:sz="0"/>
-              <w:right w:val="none" w:color="FFFFFF" w:sz="0"/>
-            </w:tcBorders>
-            <w:shd w:fill="FFFFFF" w:val="clear"/>
-            <w:tcMar>
-              <w:top w:type="dxa" w:w="50"/>
-              <w:left w:type="dxa" w:w="100"/>
-              <w:bottom w:type="dxa" w:w="50"/>
-              <w:right w:type="dxa" w:w="100"/>
-            </w:tcMar>
-          </w:tcPr>
-          <w:p>
-            <w:pPr>
-              <w:spacing w:after="0"/>
-            </w:pPr>
-            <w:r>
-              <w:rPr>
-                <w:rFonts w:ascii="Times New Roman" w:cs="Times New Roman" w:eastAsia="Times New Roman" w:hAnsi="Times New Roman"/>
-                <w:color w:val="1A1A1A"/>
-                <w:sz w:val="20"/>
-                <w:szCs w:val="20"/>
-              </w:rPr>
-              <w:t xml:space="preserve">Optimisation continue de l’attaque</w:t>
-            </w:r>
-          </w:p>
-        </w:tc>
-      </w:tr>
-      <w:tr>
-        <w:tc>
-          <w:tcPr>
-            <w:tcW w:type="dxa" w:w="4000"/>
-            <w:tcBorders>
-              <w:top w:val="none" w:color="FFFFFF" w:sz="0"/>
-              <w:left w:val="none" w:color="FFFFFF" w:sz="0"/>
-              <w:bottom w:val="single" w:color="1B263B" w:sz="1"/>
-              <w:right w:val="none" w:color="FFFFFF" w:sz="0"/>
-            </w:tcBorders>
-            <w:shd w:fill="EDEFF2" w:val="clear"/>
-            <w:tcMar>
-              <w:top w:type="dxa" w:w="50"/>
-              <w:left w:type="dxa" w:w="100"/>
-              <w:bottom w:type="dxa" w:w="50"/>
-              <w:right w:type="dxa" w:w="100"/>
-            </w:tcMar>
-          </w:tcPr>
-          <w:p>
-            <w:pPr>
-              <w:spacing w:after="0"/>
-            </w:pPr>
-            <w:r>
-              <w:rPr>
-                <w:rFonts w:ascii="Times New Roman" w:cs="Times New Roman" w:eastAsia="Times New Roman" w:hAnsi="Times New Roman"/>
-                <w:color w:val="1A1A1A"/>
-                <w:sz w:val="20"/>
-                <w:szCs w:val="20"/>
-              </w:rPr>
-              <w:t xml:space="preserve">Attaques multi-vecteurs</w:t>
-            </w:r>
-          </w:p>
-        </w:tc>
-        <w:tc>
-          <w:tcPr>
-            <w:tcW w:type="dxa" w:w="5000"/>
-            <w:tcBorders>
-              <w:top w:val="none" w:color="FFFFFF" w:sz="0"/>
-              <w:left w:val="none" w:color="FFFFFF" w:sz="0"/>
-              <w:bottom w:val="single" w:color="1B263B" w:sz="1"/>
-              <w:right w:val="none" w:color="FFFFFF" w:sz="0"/>
-            </w:tcBorders>
-            <w:shd w:fill="EDEFF2" w:val="clear"/>
-            <w:tcMar>
-              <w:top w:type="dxa" w:w="50"/>
-              <w:left w:type="dxa" w:w="100"/>
-              <w:bottom w:type="dxa" w:w="50"/>
-              <w:right w:type="dxa" w:w="100"/>
-            </w:tcMar>
-          </w:tcPr>
-          <w:p>
-            <w:pPr>
-              <w:spacing w:after="0"/>
-            </w:pPr>
-            <w:r>
-              <w:rPr>
-                <w:rFonts w:ascii="Times New Roman" w:cs="Times New Roman" w:eastAsia="Times New Roman" w:hAnsi="Times New Roman"/>
-                <w:color w:val="1A1A1A"/>
-                <w:sz w:val="20"/>
-                <w:szCs w:val="20"/>
-              </w:rPr>
-              <w:t xml:space="preserve">SYN + UDP + HTTP combinés et coordonnés</w:t>
-            </w:r>
-          </w:p>
-        </w:tc>
-      </w:tr>
-    </w:tbl>
-    <w:p>
-      <w:pPr>
-        <w:spacing w:after="140"/>
-      </w:pPr>
-    </w:p>
-    <w:p>
-      <w:pPr>
-        <w:pStyle w:val="Heading1"/>
-        <w:spacing w:after="200" w:before="400"/>
-      </w:pPr>
-      <w:r>
-        <w:rPr>
-          <w:rFonts w:ascii="Times New Roman" w:cs="Times New Roman" w:eastAsia="Times New Roman" w:hAnsi="Times New Roman"/>
-          <w:b/>
-          <w:bCs/>
-          <w:color w:val="1B263B"/>
-          <w:sz w:val="32"/>
-          <w:szCs w:val="32"/>
-        </w:rPr>
-        <w:t xml:space="preserve">7. Impact de l’IA sur la détection</w:t>
-      </w:r>
-    </w:p>
-    <w:p>
-      <w:pPr>
-        <w:pStyle w:val="Heading2"/>
-        <w:spacing w:after="120" w:before="280"/>
-      </w:pPr>
-      <w:r>
-        <w:rPr>
-          <w:rFonts w:ascii="Times New Roman" w:cs="Times New Roman" w:eastAsia="Times New Roman" w:hAnsi="Times New Roman"/>
-          <w:b/>
-          <w:bCs/>
-          <w:color w:val="415A77"/>
-          <w:sz w:val="26"/>
-          <w:szCs w:val="26"/>
-        </w:rPr>
-        <w:t xml:space="preserve">7.1 Apprentissage supervisé</w:t>
-      </w:r>
-    </w:p>
-    <w:p>
-      <w:pPr>
-        <w:spacing w:after="100" w:before="40" w:line="320"/>
-        <w:jc w:val="both"/>
-      </w:pPr>
-      <w:r>
-        <w:rPr>
-          <w:rFonts w:ascii="Times New Roman" w:cs="Times New Roman" w:eastAsia="Times New Roman" w:hAnsi="Times New Roman"/>
-          <w:color w:val="1A1A1A"/>
-          <w:sz w:val="22"/>
-          <w:szCs w:val="22"/>
-        </w:rPr>
-        <w:t xml:space="preserve">L’apprentissage supervisé consiste à entraîner un modèle sur des données labellisées (trafic normal vs trafic d’attaque). Les algorithmes les plus employés sont Random Forest, SVM, XGBoost et les réseaux de neurones. Cette approche offre une précision élevée sur les attaques connues, mais ne permet pas de détecter les variantes zero-day.</w:t>
-      </w:r>
-    </w:p>
-    <w:p>
-      <w:pPr>
-        <w:pStyle w:val="Heading2"/>
-        <w:spacing w:after="120" w:before="280"/>
-      </w:pPr>
-      <w:r>
-        <w:rPr>
-          <w:rFonts w:ascii="Times New Roman" w:cs="Times New Roman" w:eastAsia="Times New Roman" w:hAnsi="Times New Roman"/>
-          <w:b/>
-          <w:bCs/>
-          <w:color w:val="415A77"/>
-          <w:sz w:val="26"/>
-          <w:szCs w:val="26"/>
-        </w:rPr>
-        <w:t xml:space="preserve">7.2 Apprentissage non supervisé</w:t>
-      </w:r>
-    </w:p>
-    <w:p>
-      <w:pPr>
-        <w:spacing w:after="100" w:before="40" w:line="320"/>
-        <w:jc w:val="both"/>
-      </w:pPr>
-      <w:r>
-        <w:rPr>
-          <w:rFonts w:ascii="Times New Roman" w:cs="Times New Roman" w:eastAsia="Times New Roman" w:hAnsi="Times New Roman"/>
-          <w:color w:val="1A1A1A"/>
-          <w:sz w:val="22"/>
-          <w:szCs w:val="22"/>
-        </w:rPr>
-        <w:t xml:space="preserve">Les auto-encodeurs, DBSCAN et Isolation Forest permettent de détecter des anomalies sans connaissance préalable des attaques. Ces méthodes identifient les comportements inconnus ou émergents, au prix d’un taux de faux positifs généralement plus élevé.</w:t>
-      </w:r>
-    </w:p>
-    <w:p>
-      <w:pPr>
-        <w:pStyle w:val="Heading2"/>
-        <w:spacing w:after="120" w:before="280"/>
-      </w:pPr>
-      <w:r>
-        <w:rPr>
-          <w:rFonts w:ascii="Times New Roman" w:cs="Times New Roman" w:eastAsia="Times New Roman" w:hAnsi="Times New Roman"/>
-          <w:b/>
-          <w:bCs/>
-          <w:color w:val="415A77"/>
-          <w:sz w:val="26"/>
-          <w:szCs w:val="26"/>
-        </w:rPr>
-        <w:t xml:space="preserve">7.3 Deep Learning en temps réel</w:t>
-      </w:r>
-    </w:p>
-    <w:p>
-      <w:pPr>
-        <w:spacing w:after="100" w:before="40" w:line="320"/>
-        <w:jc w:val="both"/>
-      </w:pPr>
-      <w:r>
-        <w:rPr>
-          <w:rFonts w:ascii="Times New Roman" w:cs="Times New Roman" w:eastAsia="Times New Roman" w:hAnsi="Times New Roman"/>
-          <w:color w:val="1A1A1A"/>
-          <w:sz w:val="22"/>
-          <w:szCs w:val="22"/>
-        </w:rPr>
-        <w:t xml:space="preserve">Les architectures CNN (extraction de motifs spatiaux) couplées aux LSTM (analyse séquentielle) permettent une analyse de flux réseau en temps réel avec une détection en quelques secondes. Ces modèles sont déployés chez la plupart des grands fournisseurs de cloud.</w:t>
-      </w:r>
-    </w:p>
-    <w:p>
-      <w:pPr>
-        <w:pStyle w:val="Heading2"/>
-        <w:spacing w:after="120" w:before="280"/>
-      </w:pPr>
-      <w:r>
-        <w:rPr>
-          <w:rFonts w:ascii="Times New Roman" w:cs="Times New Roman" w:eastAsia="Times New Roman" w:hAnsi="Times New Roman"/>
-          <w:b/>
-          <w:bCs/>
-          <w:color w:val="415A77"/>
-          <w:sz w:val="26"/>
-          <w:szCs w:val="26"/>
-        </w:rPr>
-        <w:t xml:space="preserve">7.4 Solutions du marché</w:t>
+        <w:t xml:space="preserve">Guides officiels</w:t>
       </w:r>
     </w:p>
     <w:p>
@@ -6589,7 +5779,7 @@
                 <w:sz w:val="20"/>
                 <w:szCs w:val="20"/>
               </w:rPr>
-              <w:t xml:space="preserve">Solution</w:t>
+              <w:t xml:space="preserve">Référence</w:t>
             </w:r>
           </w:p>
         </w:tc>
@@ -6623,7 +5813,7 @@
                 <w:sz w:val="20"/>
                 <w:szCs w:val="20"/>
               </w:rPr>
-              <w:t xml:space="preserve">Approche technologique</w:t>
+              <w:t xml:space="preserve">Titre</w:t>
             </w:r>
           </w:p>
         </w:tc>
@@ -6657,7 +5847,7 @@
                 <w:sz w:val="20"/>
                 <w:szCs w:val="20"/>
               </w:rPr>
-              <w:t xml:space="preserve">Cloudflare</w:t>
+              <w:t xml:space="preserve">CERTFR-2026-CTI-002</w:t>
             </w:r>
           </w:p>
         </w:tc>
@@ -6689,7 +5879,7 @@
                 <w:sz w:val="20"/>
                 <w:szCs w:val="20"/>
               </w:rPr>
-              <w:t xml:space="preserve">Machine learning pour la classification automatique</w:t>
+              <w:t xml:space="preserve">Menaces et tendances cyber 2026</w:t>
             </w:r>
           </w:p>
         </w:tc>
@@ -6723,7 +5913,7 @@
                 <w:sz w:val="20"/>
                 <w:szCs w:val="20"/>
               </w:rPr>
-              <w:t xml:space="preserve">AWS Shield Advanced</w:t>
+              <w:t xml:space="preserve">CERTFR-2024-RFX-010-2</w:t>
             </w:r>
           </w:p>
         </w:tc>
@@ -6755,7 +5945,7 @@
                 <w:sz w:val="20"/>
                 <w:szCs w:val="20"/>
               </w:rPr>
-              <w:t xml:space="preserve">Détection comportementale + règles heuristiques</w:t>
+              <w:t xml:space="preserve">Recommandations pour la gestion de crise cyber</w:t>
             </w:r>
           </w:p>
         </w:tc>
@@ -6789,7 +5979,7 @@
                 <w:sz w:val="20"/>
                 <w:szCs w:val="20"/>
               </w:rPr>
-              <w:t xml:space="preserve">Google Cloud Armor</w:t>
+              <w:t xml:space="preserve">CERTFR-2024-RFX-009-2</w:t>
             </w:r>
           </w:p>
         </w:tc>
@@ -6821,7 +6011,7 @@
                 <w:sz w:val="20"/>
                 <w:szCs w:val="20"/>
               </w:rPr>
-              <w:t xml:space="preserve">Adaptive Protection (ML)</w:t>
+              <w:t xml:space="preserve">Guide de réponse aux incidents</w:t>
             </w:r>
           </w:p>
         </w:tc>
@@ -6855,7 +6045,7 @@
                 <w:sz w:val="20"/>
                 <w:szCs w:val="20"/>
               </w:rPr>
-              <w:t xml:space="preserve">Darktrace</w:t>
+              <w:t xml:space="preserve">ANSSI</w:t>
             </w:r>
           </w:p>
         </w:tc>
@@ -6887,7 +6077,7 @@
                 <w:sz w:val="20"/>
                 <w:szCs w:val="20"/>
               </w:rPr>
-              <w:t xml:space="preserve">Auto-encodeurs pour la détection d’anomalies</w:t>
+              <w:t xml:space="preserve">Guide DDoS — Recommandations</w:t>
             </w:r>
           </w:p>
         </w:tc>
@@ -6899,7 +6089,7 @@
             <w:tcBorders>
               <w:top w:val="none" w:color="FFFFFF" w:sz="0"/>
               <w:left w:val="none" w:color="FFFFFF" w:sz="0"/>
-              <w:bottom w:val="none" w:color="FFFFFF" w:sz="0"/>
+              <w:bottom w:val="single" w:color="1B263B" w:sz="1"/>
               <w:right w:val="none" w:color="FFFFFF" w:sz="0"/>
             </w:tcBorders>
             <w:shd w:fill="FFFFFF" w:val="clear"/>
@@ -6921,7 +6111,7 @@
                 <w:sz w:val="20"/>
                 <w:szCs w:val="20"/>
               </w:rPr>
-              <w:t xml:space="preserve">Radware</w:t>
+              <w:t xml:space="preserve">Cybermalveillance.gouv.fr</w:t>
             </w:r>
           </w:p>
         </w:tc>
@@ -6931,7 +6121,7 @@
             <w:tcBorders>
               <w:top w:val="none" w:color="FFFFFF" w:sz="0"/>
               <w:left w:val="none" w:color="FFFFFF" w:sz="0"/>
-              <w:bottom w:val="none" w:color="FFFFFF" w:sz="0"/>
+              <w:bottom w:val="single" w:color="1B263B" w:sz="1"/>
               <w:right w:val="none" w:color="FFFFFF" w:sz="0"/>
             </w:tcBorders>
             <w:shd w:fill="FFFFFF" w:val="clear"/>
@@ -6953,635 +6143,7 @@
                 <w:sz w:val="20"/>
                 <w:szCs w:val="20"/>
               </w:rPr>
-              <w:t xml:space="preserve">Détection comportementale</w:t>
-            </w:r>
-          </w:p>
-        </w:tc>
-      </w:tr>
-      <w:tr>
-        <w:tc>
-          <w:tcPr>
-            <w:tcW w:type="dxa" w:w="3500"/>
-            <w:tcBorders>
-              <w:top w:val="none" w:color="FFFFFF" w:sz="0"/>
-              <w:left w:val="none" w:color="FFFFFF" w:sz="0"/>
-              <w:bottom w:val="single" w:color="1B263B" w:sz="1"/>
-              <w:right w:val="none" w:color="FFFFFF" w:sz="0"/>
-            </w:tcBorders>
-            <w:shd w:fill="EDEFF2" w:val="clear"/>
-            <w:tcMar>
-              <w:top w:type="dxa" w:w="50"/>
-              <w:left w:type="dxa" w:w="100"/>
-              <w:bottom w:type="dxa" w:w="50"/>
-              <w:right w:type="dxa" w:w="100"/>
-            </w:tcMar>
-          </w:tcPr>
-          <w:p>
-            <w:pPr>
-              <w:spacing w:after="0"/>
-            </w:pPr>
-            <w:r>
-              <w:rPr>
-                <w:rFonts w:ascii="Times New Roman" w:cs="Times New Roman" w:eastAsia="Times New Roman" w:hAnsi="Times New Roman"/>
-                <w:color w:val="1A1A1A"/>
-                <w:sz w:val="20"/>
-                <w:szCs w:val="20"/>
-              </w:rPr>
-              <w:t xml:space="preserve">Akamai Prolexic</w:t>
-            </w:r>
-          </w:p>
-        </w:tc>
-        <w:tc>
-          <w:tcPr>
-            <w:tcW w:type="dxa" w:w="5500"/>
-            <w:tcBorders>
-              <w:top w:val="none" w:color="FFFFFF" w:sz="0"/>
-              <w:left w:val="none" w:color="FFFFFF" w:sz="0"/>
-              <w:bottom w:val="single" w:color="1B263B" w:sz="1"/>
-              <w:right w:val="none" w:color="FFFFFF" w:sz="0"/>
-            </w:tcBorders>
-            <w:shd w:fill="EDEFF2" w:val="clear"/>
-            <w:tcMar>
-              <w:top w:type="dxa" w:w="50"/>
-              <w:left w:type="dxa" w:w="100"/>
-              <w:bottom w:type="dxa" w:w="50"/>
-              <w:right w:type="dxa" w:w="100"/>
-            </w:tcMar>
-          </w:tcPr>
-          <w:p>
-            <w:pPr>
-              <w:spacing w:after="0"/>
-            </w:pPr>
-            <w:r>
-              <w:rPr>
-                <w:rFonts w:ascii="Times New Roman" w:cs="Times New Roman" w:eastAsia="Times New Roman" w:hAnsi="Times New Roman"/>
-                <w:color w:val="1A1A1A"/>
-                <w:sz w:val="20"/>
-                <w:szCs w:val="20"/>
-              </w:rPr>
-              <w:t xml:space="preserve">Analyse prédictive et apprentissage continu</w:t>
-            </w:r>
-          </w:p>
-        </w:tc>
-      </w:tr>
-    </w:tbl>
-    <w:p>
-      <w:pPr>
-        <w:spacing w:after="140"/>
-      </w:pPr>
-    </w:p>
-    <w:p>
-      <w:pPr>
-        <w:pStyle w:val="Heading2"/>
-        <w:spacing w:after="120" w:before="280"/>
-      </w:pPr>
-      <w:r>
-        <w:rPr>
-          <w:rFonts w:ascii="Times New Roman" w:cs="Times New Roman" w:eastAsia="Times New Roman" w:hAnsi="Times New Roman"/>
-          <w:b/>
-          <w:bCs/>
-          <w:color w:val="415A77"/>
-          <w:sz w:val="26"/>
-          <w:szCs w:val="26"/>
-        </w:rPr>
-        <w:t xml:space="preserve">7.5 Course aux armements IA</w:t>
-      </w:r>
-    </w:p>
-    <w:p>
-      <w:pPr>
-        <w:spacing w:after="100" w:before="40" w:line="320"/>
-        <w:jc w:val="both"/>
-      </w:pPr>
-      <w:r>
-        <w:rPr>
-          <w:rFonts w:ascii="Times New Roman" w:cs="Times New Roman" w:eastAsia="Times New Roman" w:hAnsi="Times New Roman"/>
-          <w:color w:val="1A1A1A"/>
-          <w:sz w:val="22"/>
-          <w:szCs w:val="22"/>
-        </w:rPr>
-        <w:t xml:space="preserve">L’avenir de la lutte anti-DDoS s’apparente à une course aux armements entre attaquants et défenseurs. Les premiers utilisent l’IA pour adapter leurs attaques en temps réel et contourner les modèles de détection. Les seconds déploient des systèmes de réponse automatique, de réentraînement continu et de honeypots intelligents. L’issue de cette compétition dépendra en grande partie de la qualité des données d’entraînement et de la rapidité d’adaptation des modèles.</w:t>
-      </w:r>
-    </w:p>
-    <w:p>
-      <w:pPr>
-        <w:pStyle w:val="Heading1"/>
-        <w:spacing w:after="200" w:before="400"/>
-      </w:pPr>
-      <w:r>
-        <w:rPr>
-          <w:rFonts w:ascii="Times New Roman" w:cs="Times New Roman" w:eastAsia="Times New Roman" w:hAnsi="Times New Roman"/>
-          <w:b/>
-          <w:bCs/>
-          <w:color w:val="1B263B"/>
-          <w:sz w:val="32"/>
-          <w:szCs w:val="32"/>
-        </w:rPr>
-        <w:t xml:space="preserve">8. Références</w:t>
-      </w:r>
-    </w:p>
-    <w:p>
-      <w:pPr>
-        <w:pStyle w:val="Heading2"/>
-        <w:spacing w:after="120" w:before="280"/>
-      </w:pPr>
-      <w:r>
-        <w:rPr>
-          <w:rFonts w:ascii="Times New Roman" w:cs="Times New Roman" w:eastAsia="Times New Roman" w:hAnsi="Times New Roman"/>
-          <w:b/>
-          <w:bCs/>
-          <w:color w:val="415A77"/>
-          <w:sz w:val="26"/>
-          <w:szCs w:val="26"/>
-        </w:rPr>
-        <w:t xml:space="preserve">Guides officiels</w:t>
-      </w:r>
-    </w:p>
-    <w:p>
-      <w:pPr>
-        <w:spacing w:after="0"/>
-      </w:pPr>
-    </w:p>
-    <w:tbl>
-      <w:tblPr>
-        <w:tblW w:type="dxa" w:w="9000"/>
-        <w:tblBorders>
-          <w:top w:val="single" w:color="auto" w:sz="4"/>
-          <w:left w:val="single" w:color="auto" w:sz="4"/>
-          <w:bottom w:val="single" w:color="auto" w:sz="4"/>
-          <w:right w:val="single" w:color="auto" w:sz="4"/>
-          <w:insideH w:val="single" w:color="auto" w:sz="4"/>
-          <w:insideV w:val="single" w:color="auto" w:sz="4"/>
-        </w:tblBorders>
-      </w:tblPr>
-      <w:tblGrid>
-        <w:gridCol w:w="3500"/>
-        <w:gridCol w:w="5500"/>
-      </w:tblGrid>
-      <w:tr>
-        <w:trPr>
-          <w:tblHeader/>
-        </w:trPr>
-        <w:tc>
-          <w:tcPr>
-            <w:tcW w:type="dxa" w:w="3500"/>
-            <w:tcBorders>
-              <w:top w:val="single" w:color="1B263B" w:sz="2"/>
-              <w:left w:val="none" w:color="FFFFFF" w:sz="0"/>
-              <w:bottom w:val="single" w:color="1B263B" w:sz="2"/>
-              <w:right w:val="none" w:color="FFFFFF" w:sz="0"/>
-            </w:tcBorders>
-            <w:shd w:fill="1B263B" w:val="clear"/>
-            <w:tcMar>
-              <w:top w:type="dxa" w:w="60"/>
-              <w:left w:type="dxa" w:w="100"/>
-              <w:bottom w:type="dxa" w:w="60"/>
-              <w:right w:type="dxa" w:w="100"/>
-            </w:tcMar>
-          </w:tcPr>
-          <w:p>
-            <w:pPr>
-              <w:spacing w:after="0"/>
-            </w:pPr>
-            <w:r>
-              <w:rPr>
-                <w:rFonts w:ascii="Times New Roman" w:cs="Times New Roman" w:eastAsia="Times New Roman" w:hAnsi="Times New Roman"/>
-                <w:b/>
-                <w:bCs/>
-                <w:color w:val="FFFFFF"/>
-                <w:sz w:val="20"/>
-                <w:szCs w:val="20"/>
-              </w:rPr>
-              <w:t xml:space="preserve">Référence</w:t>
-            </w:r>
-          </w:p>
-        </w:tc>
-        <w:tc>
-          <w:tcPr>
-            <w:tcW w:type="dxa" w:w="5500"/>
-            <w:tcBorders>
-              <w:top w:val="single" w:color="1B263B" w:sz="2"/>
-              <w:left w:val="none" w:color="FFFFFF" w:sz="0"/>
-              <w:bottom w:val="single" w:color="1B263B" w:sz="2"/>
-              <w:right w:val="none" w:color="FFFFFF" w:sz="0"/>
-            </w:tcBorders>
-            <w:shd w:fill="1B263B" w:val="clear"/>
-            <w:tcMar>
-              <w:top w:type="dxa" w:w="60"/>
-              <w:left w:type="dxa" w:w="100"/>
-              <w:bottom w:type="dxa" w:w="60"/>
-              <w:right w:type="dxa" w:w="100"/>
-            </w:tcMar>
-          </w:tcPr>
-          <w:p>
-            <w:pPr>
-              <w:spacing w:after="0"/>
-            </w:pPr>
-            <w:r>
-              <w:rPr>
-                <w:rFonts w:ascii="Times New Roman" w:cs="Times New Roman" w:eastAsia="Times New Roman" w:hAnsi="Times New Roman"/>
-                <w:b/>
-                <w:bCs/>
-                <w:color w:val="FFFFFF"/>
-                <w:sz w:val="20"/>
-                <w:szCs w:val="20"/>
-              </w:rPr>
-              <w:t xml:space="preserve">Titre</w:t>
-            </w:r>
-          </w:p>
-        </w:tc>
-      </w:tr>
-      <w:tr>
-        <w:tc>
-          <w:tcPr>
-            <w:tcW w:type="dxa" w:w="3500"/>
-            <w:tcBorders>
-              <w:top w:val="none" w:color="FFFFFF" w:sz="0"/>
-              <w:left w:val="none" w:color="FFFFFF" w:sz="0"/>
-              <w:bottom w:val="none" w:color="FFFFFF" w:sz="0"/>
-              <w:right w:val="none" w:color="FFFFFF" w:sz="0"/>
-            </w:tcBorders>
-            <w:shd w:fill="FFFFFF" w:val="clear"/>
-            <w:tcMar>
-              <w:top w:type="dxa" w:w="50"/>
-              <w:left w:type="dxa" w:w="100"/>
-              <w:bottom w:type="dxa" w:w="50"/>
-              <w:right w:type="dxa" w:w="100"/>
-            </w:tcMar>
-          </w:tcPr>
-          <w:p>
-            <w:pPr>
-              <w:spacing w:after="0"/>
-            </w:pPr>
-            <w:r>
-              <w:rPr>
-                <w:rFonts w:ascii="Times New Roman" w:cs="Times New Roman" w:eastAsia="Times New Roman" w:hAnsi="Times New Roman"/>
-                <w:color w:val="1A1A1A"/>
-                <w:sz w:val="20"/>
-                <w:szCs w:val="20"/>
-              </w:rPr>
-              <w:t xml:space="preserve">CERTFR-2026-CTI-002</w:t>
-            </w:r>
-          </w:p>
-        </w:tc>
-        <w:tc>
-          <w:tcPr>
-            <w:tcW w:type="dxa" w:w="5500"/>
-            <w:tcBorders>
-              <w:top w:val="none" w:color="FFFFFF" w:sz="0"/>
-              <w:left w:val="none" w:color="FFFFFF" w:sz="0"/>
-              <w:bottom w:val="none" w:color="FFFFFF" w:sz="0"/>
-              <w:right w:val="none" w:color="FFFFFF" w:sz="0"/>
-            </w:tcBorders>
-            <w:shd w:fill="FFFFFF" w:val="clear"/>
-            <w:tcMar>
-              <w:top w:type="dxa" w:w="50"/>
-              <w:left w:type="dxa" w:w="100"/>
-              <w:bottom w:type="dxa" w:w="50"/>
-              <w:right w:type="dxa" w:w="100"/>
-            </w:tcMar>
-          </w:tcPr>
-          <w:p>
-            <w:pPr>
-              <w:spacing w:after="0"/>
-            </w:pPr>
-            <w:r>
-              <w:rPr>
-                <w:rFonts w:ascii="Times New Roman" w:cs="Times New Roman" w:eastAsia="Times New Roman" w:hAnsi="Times New Roman"/>
-                <w:color w:val="1A1A1A"/>
-                <w:sz w:val="20"/>
-                <w:szCs w:val="20"/>
-              </w:rPr>
-              <w:t xml:space="preserve">Menaces et tendances cyber 2026</w:t>
-            </w:r>
-          </w:p>
-        </w:tc>
-      </w:tr>
-      <w:tr>
-        <w:tc>
-          <w:tcPr>
-            <w:tcW w:type="dxa" w:w="3500"/>
-            <w:tcBorders>
-              <w:top w:val="none" w:color="FFFFFF" w:sz="0"/>
-              <w:left w:val="none" w:color="FFFFFF" w:sz="0"/>
-              <w:bottom w:val="none" w:color="FFFFFF" w:sz="0"/>
-              <w:right w:val="none" w:color="FFFFFF" w:sz="0"/>
-            </w:tcBorders>
-            <w:shd w:fill="EDEFF2" w:val="clear"/>
-            <w:tcMar>
-              <w:top w:type="dxa" w:w="50"/>
-              <w:left w:type="dxa" w:w="100"/>
-              <w:bottom w:type="dxa" w:w="50"/>
-              <w:right w:type="dxa" w:w="100"/>
-            </w:tcMar>
-          </w:tcPr>
-          <w:p>
-            <w:pPr>
-              <w:spacing w:after="0"/>
-            </w:pPr>
-            <w:r>
-              <w:rPr>
-                <w:rFonts w:ascii="Times New Roman" w:cs="Times New Roman" w:eastAsia="Times New Roman" w:hAnsi="Times New Roman"/>
-                <w:color w:val="1A1A1A"/>
-                <w:sz w:val="20"/>
-                <w:szCs w:val="20"/>
-              </w:rPr>
-              <w:t xml:space="preserve">CERTFR-2024-RFX-010-2</w:t>
-            </w:r>
-          </w:p>
-        </w:tc>
-        <w:tc>
-          <w:tcPr>
-            <w:tcW w:type="dxa" w:w="5500"/>
-            <w:tcBorders>
-              <w:top w:val="none" w:color="FFFFFF" w:sz="0"/>
-              <w:left w:val="none" w:color="FFFFFF" w:sz="0"/>
-              <w:bottom w:val="none" w:color="FFFFFF" w:sz="0"/>
-              <w:right w:val="none" w:color="FFFFFF" w:sz="0"/>
-            </w:tcBorders>
-            <w:shd w:fill="EDEFF2" w:val="clear"/>
-            <w:tcMar>
-              <w:top w:type="dxa" w:w="50"/>
-              <w:left w:type="dxa" w:w="100"/>
-              <w:bottom w:type="dxa" w:w="50"/>
-              <w:right w:type="dxa" w:w="100"/>
-            </w:tcMar>
-          </w:tcPr>
-          <w:p>
-            <w:pPr>
-              <w:spacing w:after="0"/>
-            </w:pPr>
-            <w:r>
-              <w:rPr>
-                <w:rFonts w:ascii="Times New Roman" w:cs="Times New Roman" w:eastAsia="Times New Roman" w:hAnsi="Times New Roman"/>
-                <w:color w:val="1A1A1A"/>
-                <w:sz w:val="20"/>
-                <w:szCs w:val="20"/>
-              </w:rPr>
-              <w:t xml:space="preserve">Recommandations pour la gestion de crise cyber</w:t>
-            </w:r>
-          </w:p>
-        </w:tc>
-      </w:tr>
-      <w:tr>
-        <w:tc>
-          <w:tcPr>
-            <w:tcW w:type="dxa" w:w="3500"/>
-            <w:tcBorders>
-              <w:top w:val="none" w:color="FFFFFF" w:sz="0"/>
-              <w:left w:val="none" w:color="FFFFFF" w:sz="0"/>
-              <w:bottom w:val="none" w:color="FFFFFF" w:sz="0"/>
-              <w:right w:val="none" w:color="FFFFFF" w:sz="0"/>
-            </w:tcBorders>
-            <w:shd w:fill="FFFFFF" w:val="clear"/>
-            <w:tcMar>
-              <w:top w:type="dxa" w:w="50"/>
-              <w:left w:type="dxa" w:w="100"/>
-              <w:bottom w:type="dxa" w:w="50"/>
-              <w:right w:type="dxa" w:w="100"/>
-            </w:tcMar>
-          </w:tcPr>
-          <w:p>
-            <w:pPr>
-              <w:spacing w:after="0"/>
-            </w:pPr>
-            <w:r>
-              <w:rPr>
-                <w:rFonts w:ascii="Times New Roman" w:cs="Times New Roman" w:eastAsia="Times New Roman" w:hAnsi="Times New Roman"/>
-                <w:color w:val="1A1A1A"/>
-                <w:sz w:val="20"/>
-                <w:szCs w:val="20"/>
-              </w:rPr>
-              <w:t xml:space="preserve">CERTFR-2024-RFX-009-2</w:t>
-            </w:r>
-          </w:p>
-        </w:tc>
-        <w:tc>
-          <w:tcPr>
-            <w:tcW w:type="dxa" w:w="5500"/>
-            <w:tcBorders>
-              <w:top w:val="none" w:color="FFFFFF" w:sz="0"/>
-              <w:left w:val="none" w:color="FFFFFF" w:sz="0"/>
-              <w:bottom w:val="none" w:color="FFFFFF" w:sz="0"/>
-              <w:right w:val="none" w:color="FFFFFF" w:sz="0"/>
-            </w:tcBorders>
-            <w:shd w:fill="FFFFFF" w:val="clear"/>
-            <w:tcMar>
-              <w:top w:type="dxa" w:w="50"/>
-              <w:left w:type="dxa" w:w="100"/>
-              <w:bottom w:type="dxa" w:w="50"/>
-              <w:right w:type="dxa" w:w="100"/>
-            </w:tcMar>
-          </w:tcPr>
-          <w:p>
-            <w:pPr>
-              <w:spacing w:after="0"/>
-            </w:pPr>
-            <w:r>
-              <w:rPr>
-                <w:rFonts w:ascii="Times New Roman" w:cs="Times New Roman" w:eastAsia="Times New Roman" w:hAnsi="Times New Roman"/>
-                <w:color w:val="1A1A1A"/>
-                <w:sz w:val="20"/>
-                <w:szCs w:val="20"/>
-              </w:rPr>
-              <w:t xml:space="preserve">Guide de réponse aux incidents</w:t>
-            </w:r>
-          </w:p>
-        </w:tc>
-      </w:tr>
-      <w:tr>
-        <w:tc>
-          <w:tcPr>
-            <w:tcW w:type="dxa" w:w="3500"/>
-            <w:tcBorders>
-              <w:top w:val="none" w:color="FFFFFF" w:sz="0"/>
-              <w:left w:val="none" w:color="FFFFFF" w:sz="0"/>
-              <w:bottom w:val="none" w:color="FFFFFF" w:sz="0"/>
-              <w:right w:val="none" w:color="FFFFFF" w:sz="0"/>
-            </w:tcBorders>
-            <w:shd w:fill="EDEFF2" w:val="clear"/>
-            <w:tcMar>
-              <w:top w:type="dxa" w:w="50"/>
-              <w:left w:type="dxa" w:w="100"/>
-              <w:bottom w:type="dxa" w:w="50"/>
-              <w:right w:type="dxa" w:w="100"/>
-            </w:tcMar>
-          </w:tcPr>
-          <w:p>
-            <w:pPr>
-              <w:spacing w:after="0"/>
-            </w:pPr>
-            <w:r>
-              <w:rPr>
-                <w:rFonts w:ascii="Times New Roman" w:cs="Times New Roman" w:eastAsia="Times New Roman" w:hAnsi="Times New Roman"/>
-                <w:color w:val="1A1A1A"/>
-                <w:sz w:val="20"/>
-                <w:szCs w:val="20"/>
-              </w:rPr>
-              <w:t xml:space="preserve">ANSSI</w:t>
-            </w:r>
-          </w:p>
-        </w:tc>
-        <w:tc>
-          <w:tcPr>
-            <w:tcW w:type="dxa" w:w="5500"/>
-            <w:tcBorders>
-              <w:top w:val="none" w:color="FFFFFF" w:sz="0"/>
-              <w:left w:val="none" w:color="FFFFFF" w:sz="0"/>
-              <w:bottom w:val="none" w:color="FFFFFF" w:sz="0"/>
-              <w:right w:val="none" w:color="FFFFFF" w:sz="0"/>
-            </w:tcBorders>
-            <w:shd w:fill="EDEFF2" w:val="clear"/>
-            <w:tcMar>
-              <w:top w:type="dxa" w:w="50"/>
-              <w:left w:type="dxa" w:w="100"/>
-              <w:bottom w:type="dxa" w:w="50"/>
-              <w:right w:type="dxa" w:w="100"/>
-            </w:tcMar>
-          </w:tcPr>
-          <w:p>
-            <w:pPr>
-              <w:spacing w:after="0"/>
-            </w:pPr>
-            <w:r>
-              <w:rPr>
-                <w:rFonts w:ascii="Times New Roman" w:cs="Times New Roman" w:eastAsia="Times New Roman" w:hAnsi="Times New Roman"/>
-                <w:color w:val="1A1A1A"/>
-                <w:sz w:val="20"/>
-                <w:szCs w:val="20"/>
-              </w:rPr>
-              <w:t xml:space="preserve">Guide DDoS — Recommandations</w:t>
-            </w:r>
-          </w:p>
-        </w:tc>
-      </w:tr>
-      <w:tr>
-        <w:tc>
-          <w:tcPr>
-            <w:tcW w:type="dxa" w:w="3500"/>
-            <w:tcBorders>
-              <w:top w:val="none" w:color="FFFFFF" w:sz="0"/>
-              <w:left w:val="none" w:color="FFFFFF" w:sz="0"/>
-              <w:bottom w:val="none" w:color="FFFFFF" w:sz="0"/>
-              <w:right w:val="none" w:color="FFFFFF" w:sz="0"/>
-            </w:tcBorders>
-            <w:shd w:fill="FFFFFF" w:val="clear"/>
-            <w:tcMar>
-              <w:top w:type="dxa" w:w="50"/>
-              <w:left w:type="dxa" w:w="100"/>
-              <w:bottom w:type="dxa" w:w="50"/>
-              <w:right w:type="dxa" w:w="100"/>
-            </w:tcMar>
-          </w:tcPr>
-          <w:p>
-            <w:pPr>
-              <w:spacing w:after="0"/>
-            </w:pPr>
-            <w:r>
-              <w:rPr>
-                <w:rFonts w:ascii="Times New Roman" w:cs="Times New Roman" w:eastAsia="Times New Roman" w:hAnsi="Times New Roman"/>
-                <w:color w:val="1A1A1A"/>
-                <w:sz w:val="20"/>
-                <w:szCs w:val="20"/>
-              </w:rPr>
-              <w:t xml:space="preserve">Cybermalveillance.gouv.fr</w:t>
-            </w:r>
-          </w:p>
-        </w:tc>
-        <w:tc>
-          <w:tcPr>
-            <w:tcW w:type="dxa" w:w="5500"/>
-            <w:tcBorders>
-              <w:top w:val="none" w:color="FFFFFF" w:sz="0"/>
-              <w:left w:val="none" w:color="FFFFFF" w:sz="0"/>
-              <w:bottom w:val="none" w:color="FFFFFF" w:sz="0"/>
-              <w:right w:val="none" w:color="FFFFFF" w:sz="0"/>
-            </w:tcBorders>
-            <w:shd w:fill="FFFFFF" w:val="clear"/>
-            <w:tcMar>
-              <w:top w:type="dxa" w:w="50"/>
-              <w:left w:type="dxa" w:w="100"/>
-              <w:bottom w:type="dxa" w:w="50"/>
-              <w:right w:type="dxa" w:w="100"/>
-            </w:tcMar>
-          </w:tcPr>
-          <w:p>
-            <w:pPr>
-              <w:spacing w:after="0"/>
-            </w:pPr>
-            <w:r>
-              <w:rPr>
-                <w:rFonts w:ascii="Times New Roman" w:cs="Times New Roman" w:eastAsia="Times New Roman" w:hAnsi="Times New Roman"/>
-                <w:color w:val="1A1A1A"/>
-                <w:sz w:val="20"/>
-                <w:szCs w:val="20"/>
-              </w:rPr>
               <w:t xml:space="preserve">Fiche réflexe DDoS</w:t>
-            </w:r>
-          </w:p>
-        </w:tc>
-      </w:tr>
-      <w:tr>
-        <w:tc>
-          <w:tcPr>
-            <w:tcW w:type="dxa" w:w="3500"/>
-            <w:tcBorders>
-              <w:top w:val="none" w:color="FFFFFF" w:sz="0"/>
-              <w:left w:val="none" w:color="FFFFFF" w:sz="0"/>
-              <w:bottom w:val="single" w:color="1B263B" w:sz="1"/>
-              <w:right w:val="none" w:color="FFFFFF" w:sz="0"/>
-            </w:tcBorders>
-            <w:shd w:fill="EDEFF2" w:val="clear"/>
-            <w:tcMar>
-              <w:top w:type="dxa" w:w="50"/>
-              <w:left w:type="dxa" w:w="100"/>
-              <w:bottom w:type="dxa" w:w="50"/>
-              <w:right w:type="dxa" w:w="100"/>
-            </w:tcMar>
-          </w:tcPr>
-          <w:p>
-            <w:pPr>
-              <w:spacing w:after="0"/>
-            </w:pPr>
-            <w:r>
-              <w:rPr>
-                <w:rFonts w:ascii="Times New Roman" w:cs="Times New Roman" w:eastAsia="Times New Roman" w:hAnsi="Times New Roman"/>
-                <w:color w:val="1A1A1A"/>
-                <w:sz w:val="20"/>
-                <w:szCs w:val="20"/>
-              </w:rPr>
-              <w:t xml:space="preserve">Akamai</w:t>
-            </w:r>
-          </w:p>
-        </w:tc>
-        <w:tc>
-          <w:tcPr>
-            <w:tcW w:type="dxa" w:w="5500"/>
-            <w:tcBorders>
-              <w:top w:val="none" w:color="FFFFFF" w:sz="0"/>
-              <w:left w:val="none" w:color="FFFFFF" w:sz="0"/>
-              <w:bottom w:val="single" w:color="1B263B" w:sz="1"/>
-              <w:right w:val="none" w:color="FFFFFF" w:sz="0"/>
-            </w:tcBorders>
-            <w:shd w:fill="EDEFF2" w:val="clear"/>
-            <w:tcMar>
-              <w:top w:type="dxa" w:w="50"/>
-              <w:left w:type="dxa" w:w="100"/>
-              <w:bottom w:type="dxa" w:w="50"/>
-              <w:right w:type="dxa" w:w="100"/>
-            </w:tcMar>
-          </w:tcPr>
-          <w:p>
-            <w:pPr>
-              <w:spacing w:after="0"/>
-            </w:pPr>
-            <w:r>
-              <w:rPr>
-                <w:rFonts w:ascii="Times New Roman" w:cs="Times New Roman" w:eastAsia="Times New Roman" w:hAnsi="Times New Roman"/>
-                <w:color w:val="1A1A1A"/>
-                <w:sz w:val="20"/>
-                <w:szCs w:val="20"/>
-              </w:rPr>
-              <w:t xml:space="preserve">What is DDoS — Glossaire</w:t>
             </w:r>
           </w:p>
         </w:tc>
@@ -7625,7 +6187,7 @@
           <w:sz w:val="22"/>
           <w:szCs w:val="22"/>
         </w:rPr>
-        <w:t xml:space="preserve">RFC 791 — Internet Protocol (fragmentation IP).</w:t>
+        <w:t xml:space="preserve">RFC 791 — Internet Protocol.</w:t>
       </w:r>
     </w:p>
     <w:p>
@@ -7644,7 +6206,7 @@
           <w:sz w:val="22"/>
           <w:szCs w:val="22"/>
         </w:rPr>
-        <w:t xml:space="preserve">RFC 9293 — Transmission Control Protocol (TCP).</w:t>
+        <w:t xml:space="preserve">RFC 9293 — Transmission Control Protocol (TCP).</w:t>
       </w:r>
     </w:p>
     <w:p>
@@ -7663,7 +6225,7 @@
           <w:sz w:val="22"/>
           <w:szCs w:val="22"/>
         </w:rPr>
-        <w:t xml:space="preserve">RFC 768 — User Datagram Protocol (UDP).</w:t>
+        <w:t xml:space="preserve">RFC 768 — User Datagram Protocol (UDP).</w:t>
       </w:r>
     </w:p>
     <w:p>
@@ -7682,7 +6244,7 @@
           <w:sz w:val="22"/>
           <w:szCs w:val="22"/>
         </w:rPr>
-        <w:t xml:space="preserve">RFC 1035 — Domain Names (DNS).</w:t>
+        <w:t xml:space="preserve">RFC 1035 — Domain Names (DNS).</w:t>
       </w:r>
     </w:p>
     <w:p>
@@ -7701,7 +6263,7 @@
           <w:sz w:val="22"/>
           <w:szCs w:val="22"/>
         </w:rPr>
-        <w:t xml:space="preserve">RFC 2827 / BCP 38 — Network Ingress Filtering.</w:t>
+        <w:t xml:space="preserve">RFC 2827 / BCP 38 — Network Ingress Filtering.</w:t>
       </w:r>
     </w:p>
     <w:p>
@@ -7720,7 +6282,7 @@
           <w:sz w:val="22"/>
           <w:szCs w:val="22"/>
         </w:rPr>
-        <w:t xml:space="preserve">RFC 4987 — TCP SYN Flooding Attacks and Common Mitigations.</w:t>
+        <w:t xml:space="preserve">RFC 4987 — TCP SYN Flooding Attacks.</w:t>
       </w:r>
     </w:p>
     <w:p>
@@ -7756,7 +6318,7 @@
           <w:sz w:val="22"/>
           <w:szCs w:val="22"/>
         </w:rPr>
-        <w:t xml:space="preserve">OWASP : DDoS Prevention Cheat Sheet.</w:t>
+        <w:t xml:space="preserve">OWASP : DDoS Prevention Cheat Sheet.</w:t>
       </w:r>
     </w:p>
     <w:p>
@@ -7775,7 +6337,7 @@
           <w:sz w:val="22"/>
           <w:szCs w:val="22"/>
         </w:rPr>
-        <w:t xml:space="preserve">CISA : Understanding and Responding to DDoS Attacks.</w:t>
+        <w:t xml:space="preserve">MITRE ATT&amp;CK : TA0040 -- Impact (techniques DDoS).</w:t>
       </w:r>
     </w:p>
     <w:p>
@@ -7794,26 +6356,7 @@
           <w:sz w:val="22"/>
           <w:szCs w:val="22"/>
         </w:rPr>
-        <w:t xml:space="preserve">MITRE ATT&amp;CK : TA0040 — Impact (techniques DDoS).</w:t>
-      </w:r>
-    </w:p>
-    <w:p>
-      <w:pPr>
-        <w:pStyle w:val="ListParagraph"/>
-        <w:numPr>
-          <w:ilvl w:val="0"/>
-          <w:numId w:val="2"/>
-        </w:numPr>
-        <w:spacing w:after="30" w:before="30" w:line="300"/>
-      </w:pPr>
-      <w:r>
-        <w:rPr>
-          <w:rFonts w:ascii="Times New Roman" w:cs="Times New Roman" w:eastAsia="Times New Roman" w:hAnsi="Times New Roman"/>
-          <w:color w:val="1A1A1A"/>
-          <w:sz w:val="22"/>
-          <w:szCs w:val="22"/>
-        </w:rPr>
-        <w:t xml:space="preserve">NIST SP 800-61 Rev.2 : Computer Security Incident Handling Guide.</w:t>
+        <w:t xml:space="preserve">NIST SP 800-61 Rev.2 : Computer Security Incident Handling Guide.</w:t>
       </w:r>
     </w:p>
     <w:p>
@@ -7833,7 +6376,7 @@
           <w:sz w:val="22"/>
           <w:szCs w:val="22"/>
         </w:rPr>
-        <w:t xml:space="preserve">Ce projet est un outil pédagogique destiné à l’apprentissage des mécanismes des attaques DDoS. Il ne doit en aucun cas être utilisé pour mener des attaques réelles, ce qui est illégal dans la grande majorité des juridictions.</w:t>
+        <w:t xml:space="preserve">Ce projet est un outil pédagogique destiné à l’apprentissage des mécanismes des attaques DDoS. Il ne doit pas être utilisé pour mener des attaques réelles -- c’est illégal et on l’a bien compris.</w:t>
       </w:r>
     </w:p>
     <w:sectPr>
@@ -7981,10 +6524,10 @@
         <w:tcPr>
           <w:tcW w:type="dxa" w:w="1200"/>
           <w:tcBorders>
-            <w:top w:val="none" w:sz="0"/>
-            <w:left w:val="none" w:sz="0"/>
-            <w:bottom w:val="none" w:sz="0"/>
-            <w:right w:val="none" w:sz="0"/>
+            <w:top w:val="none" w:color="FFFFFF" w:sz="0"/>
+            <w:left w:val="none" w:color="FFFFFF" w:sz="0"/>
+            <w:bottom w:val="none" w:color="FFFFFF" w:sz="0"/>
+            <w:right w:val="none" w:color="FFFFFF" w:sz="0"/>
           </w:tcBorders>
           <w:tcMar>
             <w:top w:type="dxa" w:w="0"/>
@@ -8044,10 +6587,10 @@
         <w:tcPr>
           <w:tcW w:type="dxa" w:w="7872"/>
           <w:tcBorders>
-            <w:top w:val="none" w:sz="0"/>
-            <w:left w:val="none" w:sz="0"/>
-            <w:bottom w:val="none" w:sz="0"/>
-            <w:right w:val="none" w:sz="0"/>
+            <w:top w:val="none" w:color="FFFFFF" w:sz="0"/>
+            <w:left w:val="none" w:color="FFFFFF" w:sz="0"/>
+            <w:bottom w:val="none" w:color="FFFFFF" w:sz="0"/>
+            <w:right w:val="none" w:color="FFFFFF" w:sz="0"/>
           </w:tcBorders>
           <w:tcMar>
             <w:top w:type="dxa" w:w="0"/>
@@ -8206,12 +6749,6 @@
   </w:num>
   <w:num w:numId="2">
     <w:abstractNumId w:val="2"/>
-    <w:lvlOverride w:ilvl="0">
-      <w:startOverride w:val="1"/>
-    </w:lvlOverride>
-  </w:num>
-  <w:num w:numId="3">
-    <w:abstractNumId w:val="3"/>
     <w:lvlOverride w:ilvl="0">
       <w:startOverride w:val="1"/>
     </w:lvlOverride>

</xml_diff>